<commit_message>
Ezekiel 16 & JL 119
</commit_message>
<xml_diff>
--- a/以西结书2025.docx
+++ b/以西结书2025.docx
@@ -60,11 +60,11 @@
           <w:r>
             <w:fldChar w:fldCharType="separate"/>
           </w:r>
-          <w:hyperlink w:anchor="_Toc215496962" w:history="1">
+          <w:hyperlink w:anchor="_Toc228177772" w:history="1">
             <w:r>
               <w:rPr>
                 <w:rStyle w:val="af2"/>
-                <w:rFonts w:ascii="Calibri" w:eastAsia="宋体" w:hAnsi="Calibri" w:cs="Times New Roman" w:hint="eastAsia"/>
+                <w:rFonts w:ascii="Calibri" w:eastAsia="宋体" w:hAnsi="Calibri" w:cs="Times New Roman"/>
                 <w:noProof/>
                 <w:kern w:val="0"/>
                 <w14:ligatures w14:val="none"/>
@@ -74,7 +74,7 @@
             <w:r>
               <w:rPr>
                 <w:rStyle w:val="af2"/>
-                <w:rFonts w:ascii="Calibri" w:eastAsia="宋体" w:hAnsi="Calibri" w:cs="Times New Roman" w:hint="eastAsia"/>
+                <w:rFonts w:ascii="Calibri" w:eastAsia="宋体" w:hAnsi="Calibri" w:cs="Times New Roman"/>
                 <w:noProof/>
                 <w:kern w:val="0"/>
                 <w14:ligatures w14:val="none"/>
@@ -84,7 +84,7 @@
             <w:r>
               <w:rPr>
                 <w:rStyle w:val="af2"/>
-                <w:rFonts w:ascii="Calibri" w:eastAsia="宋体" w:hAnsi="Calibri" w:cs="Times New Roman" w:hint="eastAsia"/>
+                <w:rFonts w:ascii="Calibri" w:eastAsia="宋体" w:hAnsi="Calibri" w:cs="Times New Roman"/>
                 <w:noProof/>
                 <w:kern w:val="0"/>
                 <w14:ligatures w14:val="none"/>
@@ -94,7 +94,7 @@
             <w:r>
               <w:rPr>
                 <w:rStyle w:val="af2"/>
-                <w:rFonts w:ascii="Calibri" w:eastAsia="宋体" w:hAnsi="Calibri" w:cs="Times New Roman" w:hint="eastAsia"/>
+                <w:rFonts w:ascii="Calibri" w:eastAsia="宋体" w:hAnsi="Calibri" w:cs="Times New Roman"/>
                 <w:noProof/>
                 <w:kern w:val="0"/>
                 <w14:ligatures w14:val="none"/>
@@ -104,7 +104,7 @@
             <w:r>
               <w:rPr>
                 <w:rStyle w:val="af2"/>
-                <w:rFonts w:ascii="Calibri" w:eastAsia="宋体" w:hAnsi="Calibri" w:cs="Times New Roman" w:hint="eastAsia"/>
+                <w:rFonts w:ascii="Calibri" w:eastAsia="宋体" w:hAnsi="Calibri" w:cs="Times New Roman"/>
                 <w:noProof/>
                 <w:kern w:val="0"/>
                 <w14:ligatures w14:val="none"/>
@@ -140,7 +140,7 @@
                 <w:noProof/>
                 <w:webHidden/>
               </w:rPr>
-              <w:instrText>PAGEREF _Toc215496962 \h</w:instrText>
+              <w:instrText>PAGEREF _Toc228177772 \h</w:instrText>
             </w:r>
             <w:r>
               <w:rPr>
@@ -194,11 +194,11 @@
               <w:noProof/>
             </w:rPr>
           </w:pPr>
-          <w:hyperlink w:anchor="_Toc215496963" w:history="1">
+          <w:hyperlink w:anchor="_Toc228177773" w:history="1">
             <w:r>
               <w:rPr>
                 <w:rStyle w:val="af2"/>
-                <w:rFonts w:ascii="Calibri" w:eastAsia="宋体" w:hAnsi="Calibri" w:cs="Times New Roman" w:hint="eastAsia"/>
+                <w:rFonts w:ascii="Calibri" w:eastAsia="宋体" w:hAnsi="Calibri" w:cs="Times New Roman"/>
                 <w:noProof/>
                 <w:kern w:val="0"/>
                 <w14:ligatures w14:val="none"/>
@@ -208,7 +208,7 @@
             <w:r>
               <w:rPr>
                 <w:rStyle w:val="af2"/>
-                <w:rFonts w:ascii="Calibri" w:eastAsia="宋体" w:hAnsi="Calibri" w:cs="Times New Roman" w:hint="eastAsia"/>
+                <w:rFonts w:ascii="Calibri" w:eastAsia="宋体" w:hAnsi="Calibri" w:cs="Times New Roman"/>
                 <w:noProof/>
                 <w:kern w:val="0"/>
                 <w14:ligatures w14:val="none"/>
@@ -218,7 +218,7 @@
             <w:r>
               <w:rPr>
                 <w:rStyle w:val="af2"/>
-                <w:rFonts w:ascii="Calibri" w:eastAsia="宋体" w:hAnsi="Calibri" w:cs="Times New Roman" w:hint="eastAsia"/>
+                <w:rFonts w:ascii="Calibri" w:eastAsia="宋体" w:hAnsi="Calibri" w:cs="Times New Roman"/>
                 <w:noProof/>
                 <w:kern w:val="0"/>
                 <w14:ligatures w14:val="none"/>
@@ -228,7 +228,7 @@
             <w:r>
               <w:rPr>
                 <w:rStyle w:val="af2"/>
-                <w:rFonts w:ascii="Calibri" w:eastAsia="宋体" w:hAnsi="Calibri" w:cs="Times New Roman" w:hint="eastAsia"/>
+                <w:rFonts w:ascii="Calibri" w:eastAsia="宋体" w:hAnsi="Calibri" w:cs="Times New Roman"/>
                 <w:noProof/>
                 <w:kern w:val="0"/>
                 <w14:ligatures w14:val="none"/>
@@ -238,7 +238,7 @@
             <w:r>
               <w:rPr>
                 <w:rStyle w:val="af2"/>
-                <w:rFonts w:ascii="Calibri" w:eastAsia="宋体" w:hAnsi="Calibri" w:cs="Times New Roman" w:hint="eastAsia"/>
+                <w:rFonts w:ascii="Calibri" w:eastAsia="宋体" w:hAnsi="Calibri" w:cs="Times New Roman"/>
                 <w:noProof/>
                 <w:kern w:val="0"/>
                 <w14:ligatures w14:val="none"/>
@@ -274,7 +274,7 @@
                 <w:noProof/>
                 <w:webHidden/>
               </w:rPr>
-              <w:instrText>PAGEREF _Toc215496963 \h</w:instrText>
+              <w:instrText>PAGEREF _Toc228177773 \h</w:instrText>
             </w:r>
             <w:r>
               <w:rPr>
@@ -328,11 +328,11 @@
               <w:noProof/>
             </w:rPr>
           </w:pPr>
-          <w:hyperlink w:anchor="_Toc215496964" w:history="1">
+          <w:hyperlink w:anchor="_Toc228177774" w:history="1">
             <w:r>
               <w:rPr>
                 <w:rStyle w:val="af2"/>
-                <w:rFonts w:ascii="Calibri" w:eastAsia="宋体" w:hAnsi="Calibri" w:cs="Times New Roman" w:hint="eastAsia"/>
+                <w:rFonts w:ascii="Calibri" w:eastAsia="宋体" w:hAnsi="Calibri" w:cs="Times New Roman"/>
                 <w:noProof/>
                 <w:kern w:val="0"/>
                 <w14:ligatures w14:val="none"/>
@@ -342,7 +342,7 @@
             <w:r>
               <w:rPr>
                 <w:rStyle w:val="af2"/>
-                <w:rFonts w:ascii="Calibri" w:eastAsia="宋体" w:hAnsi="Calibri" w:cs="Times New Roman" w:hint="eastAsia"/>
+                <w:rFonts w:ascii="Calibri" w:eastAsia="宋体" w:hAnsi="Calibri" w:cs="Times New Roman"/>
                 <w:noProof/>
                 <w:kern w:val="0"/>
                 <w14:ligatures w14:val="none"/>
@@ -352,7 +352,7 @@
             <w:r>
               <w:rPr>
                 <w:rStyle w:val="af2"/>
-                <w:rFonts w:ascii="Calibri" w:eastAsia="宋体" w:hAnsi="Calibri" w:cs="Times New Roman" w:hint="eastAsia"/>
+                <w:rFonts w:ascii="Calibri" w:eastAsia="宋体" w:hAnsi="Calibri" w:cs="Times New Roman"/>
                 <w:noProof/>
                 <w:kern w:val="0"/>
                 <w14:ligatures w14:val="none"/>
@@ -362,7 +362,7 @@
             <w:r>
               <w:rPr>
                 <w:rStyle w:val="af2"/>
-                <w:rFonts w:ascii="Calibri" w:eastAsia="宋体" w:hAnsi="Calibri" w:cs="Times New Roman" w:hint="eastAsia"/>
+                <w:rFonts w:ascii="Calibri" w:eastAsia="宋体" w:hAnsi="Calibri" w:cs="Times New Roman"/>
                 <w:noProof/>
                 <w:kern w:val="0"/>
                 <w14:ligatures w14:val="none"/>
@@ -372,7 +372,7 @@
             <w:r>
               <w:rPr>
                 <w:rStyle w:val="af2"/>
-                <w:rFonts w:ascii="Calibri" w:eastAsia="宋体" w:hAnsi="Calibri" w:cs="Times New Roman" w:hint="eastAsia"/>
+                <w:rFonts w:ascii="Calibri" w:eastAsia="宋体" w:hAnsi="Calibri" w:cs="Times New Roman"/>
                 <w:noProof/>
                 <w:kern w:val="0"/>
                 <w14:ligatures w14:val="none"/>
@@ -408,7 +408,7 @@
                 <w:noProof/>
                 <w:webHidden/>
               </w:rPr>
-              <w:instrText>PAGEREF _Toc215496964 \h</w:instrText>
+              <w:instrText>PAGEREF _Toc228177774 \h</w:instrText>
             </w:r>
             <w:r>
               <w:rPr>
@@ -462,11 +462,11 @@
               <w:noProof/>
             </w:rPr>
           </w:pPr>
-          <w:hyperlink w:anchor="_Toc215496965" w:history="1">
+          <w:hyperlink w:anchor="_Toc228177775" w:history="1">
             <w:r>
               <w:rPr>
                 <w:rStyle w:val="af2"/>
-                <w:rFonts w:ascii="Calibri" w:eastAsia="宋体" w:hAnsi="Calibri" w:cs="Times New Roman" w:hint="eastAsia"/>
+                <w:rFonts w:ascii="Calibri" w:eastAsia="宋体" w:hAnsi="Calibri" w:cs="Times New Roman"/>
                 <w:noProof/>
                 <w:kern w:val="0"/>
                 <w14:ligatures w14:val="none"/>
@@ -476,7 +476,7 @@
             <w:r>
               <w:rPr>
                 <w:rStyle w:val="af2"/>
-                <w:rFonts w:ascii="Calibri" w:eastAsia="宋体" w:hAnsi="Calibri" w:cs="Times New Roman" w:hint="eastAsia"/>
+                <w:rFonts w:ascii="Calibri" w:eastAsia="宋体" w:hAnsi="Calibri" w:cs="Times New Roman"/>
                 <w:noProof/>
                 <w:kern w:val="0"/>
                 <w14:ligatures w14:val="none"/>
@@ -486,7 +486,7 @@
             <w:r>
               <w:rPr>
                 <w:rStyle w:val="af2"/>
-                <w:rFonts w:ascii="Calibri" w:eastAsia="宋体" w:hAnsi="Calibri" w:cs="Times New Roman" w:hint="eastAsia"/>
+                <w:rFonts w:ascii="Calibri" w:eastAsia="宋体" w:hAnsi="Calibri" w:cs="Times New Roman"/>
                 <w:noProof/>
                 <w:kern w:val="0"/>
                 <w14:ligatures w14:val="none"/>
@@ -496,7 +496,7 @@
             <w:r>
               <w:rPr>
                 <w:rStyle w:val="af2"/>
-                <w:rFonts w:ascii="Calibri" w:eastAsia="宋体" w:hAnsi="Calibri" w:cs="Times New Roman" w:hint="eastAsia"/>
+                <w:rFonts w:ascii="Calibri" w:eastAsia="宋体" w:hAnsi="Calibri" w:cs="Times New Roman"/>
                 <w:noProof/>
                 <w:kern w:val="0"/>
                 <w14:ligatures w14:val="none"/>
@@ -506,7 +506,7 @@
             <w:r>
               <w:rPr>
                 <w:rStyle w:val="af2"/>
-                <w:rFonts w:ascii="Calibri" w:eastAsia="宋体" w:hAnsi="Calibri" w:cs="Times New Roman" w:hint="eastAsia"/>
+                <w:rFonts w:ascii="Calibri" w:eastAsia="宋体" w:hAnsi="Calibri" w:cs="Times New Roman"/>
                 <w:noProof/>
                 <w:kern w:val="0"/>
                 <w14:ligatures w14:val="none"/>
@@ -542,7 +542,7 @@
                 <w:noProof/>
                 <w:webHidden/>
               </w:rPr>
-              <w:instrText>PAGEREF _Toc215496965 \h</w:instrText>
+              <w:instrText>PAGEREF _Toc228177775 \h</w:instrText>
             </w:r>
             <w:r>
               <w:rPr>
@@ -596,11 +596,11 @@
               <w:noProof/>
             </w:rPr>
           </w:pPr>
-          <w:hyperlink w:anchor="_Toc215496966" w:history="1">
+          <w:hyperlink w:anchor="_Toc228177776" w:history="1">
             <w:r>
               <w:rPr>
                 <w:rStyle w:val="af2"/>
-                <w:rFonts w:ascii="Calibri" w:eastAsia="宋体" w:hAnsi="Calibri" w:cs="Times New Roman" w:hint="eastAsia"/>
+                <w:rFonts w:ascii="Calibri" w:eastAsia="宋体" w:hAnsi="Calibri" w:cs="Times New Roman"/>
                 <w:noProof/>
                 <w:kern w:val="0"/>
                 <w14:ligatures w14:val="none"/>
@@ -610,7 +610,7 @@
             <w:r>
               <w:rPr>
                 <w:rStyle w:val="af2"/>
-                <w:rFonts w:ascii="Calibri" w:eastAsia="宋体" w:hAnsi="Calibri" w:cs="Times New Roman" w:hint="eastAsia"/>
+                <w:rFonts w:ascii="Calibri" w:eastAsia="宋体" w:hAnsi="Calibri" w:cs="Times New Roman"/>
                 <w:noProof/>
                 <w:kern w:val="0"/>
                 <w14:ligatures w14:val="none"/>
@@ -620,7 +620,7 @@
             <w:r>
               <w:rPr>
                 <w:rStyle w:val="af2"/>
-                <w:rFonts w:ascii="Calibri" w:eastAsia="宋体" w:hAnsi="Calibri" w:cs="Times New Roman" w:hint="eastAsia"/>
+                <w:rFonts w:ascii="Calibri" w:eastAsia="宋体" w:hAnsi="Calibri" w:cs="Times New Roman"/>
                 <w:noProof/>
                 <w:kern w:val="0"/>
                 <w14:ligatures w14:val="none"/>
@@ -630,7 +630,7 @@
             <w:r>
               <w:rPr>
                 <w:rStyle w:val="af2"/>
-                <w:rFonts w:ascii="Calibri" w:eastAsia="宋体" w:hAnsi="Calibri" w:cs="Times New Roman" w:hint="eastAsia"/>
+                <w:rFonts w:ascii="Calibri" w:eastAsia="宋体" w:hAnsi="Calibri" w:cs="Times New Roman"/>
                 <w:noProof/>
                 <w:kern w:val="0"/>
                 <w14:ligatures w14:val="none"/>
@@ -640,7 +640,7 @@
             <w:r>
               <w:rPr>
                 <w:rStyle w:val="af2"/>
-                <w:rFonts w:ascii="Calibri" w:eastAsia="宋体" w:hAnsi="Calibri" w:cs="Times New Roman" w:hint="eastAsia"/>
+                <w:rFonts w:ascii="Calibri" w:eastAsia="宋体" w:hAnsi="Calibri" w:cs="Times New Roman"/>
                 <w:noProof/>
                 <w:kern w:val="0"/>
                 <w14:ligatures w14:val="none"/>
@@ -676,7 +676,7 @@
                 <w:noProof/>
                 <w:webHidden/>
               </w:rPr>
-              <w:instrText>PAGEREF _Toc215496966 \h</w:instrText>
+              <w:instrText>PAGEREF _Toc228177776 \h</w:instrText>
             </w:r>
             <w:r>
               <w:rPr>
@@ -730,11 +730,11 @@
               <w:noProof/>
             </w:rPr>
           </w:pPr>
-          <w:hyperlink w:anchor="_Toc215496967" w:history="1">
+          <w:hyperlink w:anchor="_Toc228177777" w:history="1">
             <w:r>
               <w:rPr>
                 <w:rStyle w:val="af2"/>
-                <w:rFonts w:ascii="Calibri" w:eastAsia="宋体" w:hAnsi="Calibri" w:cs="Times New Roman" w:hint="eastAsia"/>
+                <w:rFonts w:ascii="Calibri" w:eastAsia="宋体" w:hAnsi="Calibri" w:cs="Times New Roman"/>
                 <w:noProof/>
                 <w:kern w:val="0"/>
                 <w14:ligatures w14:val="none"/>
@@ -744,7 +744,7 @@
             <w:r>
               <w:rPr>
                 <w:rStyle w:val="af2"/>
-                <w:rFonts w:ascii="Calibri" w:eastAsia="宋体" w:hAnsi="Calibri" w:cs="Times New Roman" w:hint="eastAsia"/>
+                <w:rFonts w:ascii="Calibri" w:eastAsia="宋体" w:hAnsi="Calibri" w:cs="Times New Roman"/>
                 <w:noProof/>
                 <w:kern w:val="0"/>
                 <w14:ligatures w14:val="none"/>
@@ -754,7 +754,7 @@
             <w:r>
               <w:rPr>
                 <w:rStyle w:val="af2"/>
-                <w:rFonts w:ascii="Calibri" w:eastAsia="宋体" w:hAnsi="Calibri" w:cs="Times New Roman" w:hint="eastAsia"/>
+                <w:rFonts w:ascii="Calibri" w:eastAsia="宋体" w:hAnsi="Calibri" w:cs="Times New Roman"/>
                 <w:noProof/>
                 <w:kern w:val="0"/>
                 <w14:ligatures w14:val="none"/>
@@ -764,7 +764,7 @@
             <w:r>
               <w:rPr>
                 <w:rStyle w:val="af2"/>
-                <w:rFonts w:ascii="Calibri" w:eastAsia="宋体" w:hAnsi="Calibri" w:cs="Times New Roman" w:hint="eastAsia"/>
+                <w:rFonts w:ascii="Calibri" w:eastAsia="宋体" w:hAnsi="Calibri" w:cs="Times New Roman"/>
                 <w:noProof/>
                 <w:kern w:val="0"/>
                 <w14:ligatures w14:val="none"/>
@@ -774,7 +774,7 @@
             <w:r>
               <w:rPr>
                 <w:rStyle w:val="af2"/>
-                <w:rFonts w:ascii="Calibri" w:eastAsia="宋体" w:hAnsi="Calibri" w:cs="Times New Roman" w:hint="eastAsia"/>
+                <w:rFonts w:ascii="Calibri" w:eastAsia="宋体" w:hAnsi="Calibri" w:cs="Times New Roman"/>
                 <w:noProof/>
                 <w:kern w:val="0"/>
                 <w14:ligatures w14:val="none"/>
@@ -810,7 +810,7 @@
                 <w:noProof/>
                 <w:webHidden/>
               </w:rPr>
-              <w:instrText>PAGEREF _Toc215496967 \h</w:instrText>
+              <w:instrText>PAGEREF _Toc228177777 \h</w:instrText>
             </w:r>
             <w:r>
               <w:rPr>
@@ -864,11 +864,11 @@
               <w:noProof/>
             </w:rPr>
           </w:pPr>
-          <w:hyperlink w:anchor="_Toc215496968" w:history="1">
+          <w:hyperlink w:anchor="_Toc228177778" w:history="1">
             <w:r>
               <w:rPr>
                 <w:rStyle w:val="af2"/>
-                <w:rFonts w:ascii="Calibri" w:eastAsia="宋体" w:hAnsi="Calibri" w:cs="Times New Roman" w:hint="eastAsia"/>
+                <w:rFonts w:ascii="Calibri" w:eastAsia="宋体" w:hAnsi="Calibri" w:cs="Times New Roman"/>
                 <w:noProof/>
                 <w:kern w:val="0"/>
                 <w14:ligatures w14:val="none"/>
@@ -878,7 +878,7 @@
             <w:r>
               <w:rPr>
                 <w:rStyle w:val="af2"/>
-                <w:rFonts w:ascii="Calibri" w:eastAsia="宋体" w:hAnsi="Calibri" w:cs="Times New Roman" w:hint="eastAsia"/>
+                <w:rFonts w:ascii="Calibri" w:eastAsia="宋体" w:hAnsi="Calibri" w:cs="Times New Roman"/>
                 <w:noProof/>
                 <w:kern w:val="0"/>
                 <w14:ligatures w14:val="none"/>
@@ -888,7 +888,7 @@
             <w:r>
               <w:rPr>
                 <w:rStyle w:val="af2"/>
-                <w:rFonts w:ascii="Calibri" w:eastAsia="宋体" w:hAnsi="Calibri" w:cs="Times New Roman" w:hint="eastAsia"/>
+                <w:rFonts w:ascii="Calibri" w:eastAsia="宋体" w:hAnsi="Calibri" w:cs="Times New Roman"/>
                 <w:noProof/>
                 <w:kern w:val="0"/>
                 <w14:ligatures w14:val="none"/>
@@ -898,7 +898,7 @@
             <w:r>
               <w:rPr>
                 <w:rStyle w:val="af2"/>
-                <w:rFonts w:ascii="Calibri" w:eastAsia="宋体" w:hAnsi="Calibri" w:cs="Times New Roman" w:hint="eastAsia"/>
+                <w:rFonts w:ascii="Calibri" w:eastAsia="宋体" w:hAnsi="Calibri" w:cs="Times New Roman"/>
                 <w:noProof/>
                 <w:kern w:val="0"/>
                 <w14:ligatures w14:val="none"/>
@@ -908,7 +908,7 @@
             <w:r>
               <w:rPr>
                 <w:rStyle w:val="af2"/>
-                <w:rFonts w:ascii="Calibri" w:eastAsia="宋体" w:hAnsi="Calibri" w:cs="Times New Roman" w:hint="eastAsia"/>
+                <w:rFonts w:ascii="Calibri" w:eastAsia="宋体" w:hAnsi="Calibri" w:cs="Times New Roman"/>
                 <w:noProof/>
                 <w:kern w:val="0"/>
                 <w14:ligatures w14:val="none"/>
@@ -944,7 +944,7 @@
                 <w:noProof/>
                 <w:webHidden/>
               </w:rPr>
-              <w:instrText>PAGEREF _Toc215496968 \h</w:instrText>
+              <w:instrText>PAGEREF _Toc228177778 \h</w:instrText>
             </w:r>
             <w:r>
               <w:rPr>
@@ -998,11 +998,11 @@
               <w:noProof/>
             </w:rPr>
           </w:pPr>
-          <w:hyperlink w:anchor="_Toc215496969" w:history="1">
+          <w:hyperlink w:anchor="_Toc228177779" w:history="1">
             <w:r>
               <w:rPr>
                 <w:rStyle w:val="af2"/>
-                <w:rFonts w:ascii="Calibri" w:eastAsia="宋体" w:hAnsi="Calibri" w:cs="Times New Roman" w:hint="eastAsia"/>
+                <w:rFonts w:ascii="Calibri" w:eastAsia="宋体" w:hAnsi="Calibri" w:cs="Times New Roman"/>
                 <w:noProof/>
                 <w:kern w:val="0"/>
                 <w14:ligatures w14:val="none"/>
@@ -1012,7 +1012,7 @@
             <w:r>
               <w:rPr>
                 <w:rStyle w:val="af2"/>
-                <w:rFonts w:ascii="Calibri" w:eastAsia="宋体" w:hAnsi="Calibri" w:cs="Times New Roman" w:hint="eastAsia"/>
+                <w:rFonts w:ascii="Calibri" w:eastAsia="宋体" w:hAnsi="Calibri" w:cs="Times New Roman"/>
                 <w:noProof/>
                 <w:kern w:val="0"/>
                 <w14:ligatures w14:val="none"/>
@@ -1022,7 +1022,7 @@
             <w:r>
               <w:rPr>
                 <w:rStyle w:val="af2"/>
-                <w:rFonts w:ascii="Calibri" w:eastAsia="宋体" w:hAnsi="Calibri" w:cs="Times New Roman" w:hint="eastAsia"/>
+                <w:rFonts w:ascii="Calibri" w:eastAsia="宋体" w:hAnsi="Calibri" w:cs="Times New Roman"/>
                 <w:noProof/>
                 <w:kern w:val="0"/>
                 <w14:ligatures w14:val="none"/>
@@ -1032,7 +1032,7 @@
             <w:r>
               <w:rPr>
                 <w:rStyle w:val="af2"/>
-                <w:rFonts w:ascii="Calibri" w:eastAsia="宋体" w:hAnsi="Calibri" w:cs="Times New Roman" w:hint="eastAsia"/>
+                <w:rFonts w:ascii="Calibri" w:eastAsia="宋体" w:hAnsi="Calibri" w:cs="Times New Roman"/>
                 <w:noProof/>
                 <w:kern w:val="0"/>
                 <w14:ligatures w14:val="none"/>
@@ -1042,7 +1042,7 @@
             <w:r>
               <w:rPr>
                 <w:rStyle w:val="af2"/>
-                <w:rFonts w:ascii="Calibri" w:eastAsia="宋体" w:hAnsi="Calibri" w:cs="Times New Roman" w:hint="eastAsia"/>
+                <w:rFonts w:ascii="Calibri" w:eastAsia="宋体" w:hAnsi="Calibri" w:cs="Times New Roman"/>
                 <w:noProof/>
                 <w:kern w:val="0"/>
                 <w14:ligatures w14:val="none"/>
@@ -1078,7 +1078,7 @@
                 <w:noProof/>
                 <w:webHidden/>
               </w:rPr>
-              <w:instrText>PAGEREF _Toc215496969 \h</w:instrText>
+              <w:instrText>PAGEREF _Toc228177779 \h</w:instrText>
             </w:r>
             <w:r>
               <w:rPr>
@@ -1132,11 +1132,11 @@
               <w:noProof/>
             </w:rPr>
           </w:pPr>
-          <w:hyperlink w:anchor="_Toc215496970" w:history="1">
+          <w:hyperlink w:anchor="_Toc228177780" w:history="1">
             <w:r>
               <w:rPr>
                 <w:rStyle w:val="af2"/>
-                <w:rFonts w:ascii="Calibri" w:eastAsia="宋体" w:hAnsi="Calibri" w:cs="Times New Roman" w:hint="eastAsia"/>
+                <w:rFonts w:ascii="Calibri" w:eastAsia="宋体" w:hAnsi="Calibri" w:cs="Times New Roman"/>
                 <w:noProof/>
                 <w:kern w:val="0"/>
                 <w14:ligatures w14:val="none"/>
@@ -1146,7 +1146,7 @@
             <w:r>
               <w:rPr>
                 <w:rStyle w:val="af2"/>
-                <w:rFonts w:ascii="Calibri" w:eastAsia="宋体" w:hAnsi="Calibri" w:cs="Times New Roman" w:hint="eastAsia"/>
+                <w:rFonts w:ascii="Calibri" w:eastAsia="宋体" w:hAnsi="Calibri" w:cs="Times New Roman"/>
                 <w:noProof/>
                 <w:kern w:val="0"/>
                 <w14:ligatures w14:val="none"/>
@@ -1156,7 +1156,7 @@
             <w:r>
               <w:rPr>
                 <w:rStyle w:val="af2"/>
-                <w:rFonts w:ascii="Calibri" w:eastAsia="宋体" w:hAnsi="Calibri" w:cs="Times New Roman" w:hint="eastAsia"/>
+                <w:rFonts w:ascii="Calibri" w:eastAsia="宋体" w:hAnsi="Calibri" w:cs="Times New Roman"/>
                 <w:noProof/>
                 <w:kern w:val="0"/>
                 <w14:ligatures w14:val="none"/>
@@ -1166,7 +1166,7 @@
             <w:r>
               <w:rPr>
                 <w:rStyle w:val="af2"/>
-                <w:rFonts w:ascii="Calibri" w:eastAsia="宋体" w:hAnsi="Calibri" w:cs="Times New Roman" w:hint="eastAsia"/>
+                <w:rFonts w:ascii="Calibri" w:eastAsia="宋体" w:hAnsi="Calibri" w:cs="Times New Roman"/>
                 <w:noProof/>
                 <w:kern w:val="0"/>
                 <w14:ligatures w14:val="none"/>
@@ -1176,7 +1176,7 @@
             <w:r>
               <w:rPr>
                 <w:rStyle w:val="af2"/>
-                <w:rFonts w:ascii="Calibri" w:eastAsia="宋体" w:hAnsi="Calibri" w:cs="Times New Roman" w:hint="eastAsia"/>
+                <w:rFonts w:ascii="Calibri" w:eastAsia="宋体" w:hAnsi="Calibri" w:cs="Times New Roman"/>
                 <w:noProof/>
                 <w:kern w:val="0"/>
                 <w14:ligatures w14:val="none"/>
@@ -1212,7 +1212,7 @@
                 <w:noProof/>
                 <w:webHidden/>
               </w:rPr>
-              <w:instrText>PAGEREF _Toc215496970 \h</w:instrText>
+              <w:instrText>PAGEREF _Toc228177780 \h</w:instrText>
             </w:r>
             <w:r>
               <w:rPr>
@@ -1266,11 +1266,11 @@
               <w:noProof/>
             </w:rPr>
           </w:pPr>
-          <w:hyperlink w:anchor="_Toc215496971" w:history="1">
+          <w:hyperlink w:anchor="_Toc228177781" w:history="1">
             <w:r>
               <w:rPr>
                 <w:rStyle w:val="af2"/>
-                <w:rFonts w:ascii="Calibri" w:eastAsia="宋体" w:hAnsi="Calibri" w:cs="Times New Roman" w:hint="eastAsia"/>
+                <w:rFonts w:ascii="Calibri" w:eastAsia="宋体" w:hAnsi="Calibri" w:cs="Times New Roman"/>
                 <w:noProof/>
                 <w:kern w:val="0"/>
                 <w14:ligatures w14:val="none"/>
@@ -1280,7 +1280,7 @@
             <w:r>
               <w:rPr>
                 <w:rStyle w:val="af2"/>
-                <w:rFonts w:ascii="Calibri" w:eastAsia="宋体" w:hAnsi="Calibri" w:cs="Times New Roman" w:hint="eastAsia"/>
+                <w:rFonts w:ascii="Calibri" w:eastAsia="宋体" w:hAnsi="Calibri" w:cs="Times New Roman"/>
                 <w:noProof/>
                 <w:kern w:val="0"/>
                 <w14:ligatures w14:val="none"/>
@@ -1290,7 +1290,7 @@
             <w:r>
               <w:rPr>
                 <w:rStyle w:val="af2"/>
-                <w:rFonts w:ascii="Calibri" w:eastAsia="宋体" w:hAnsi="Calibri" w:cs="Times New Roman" w:hint="eastAsia"/>
+                <w:rFonts w:ascii="Calibri" w:eastAsia="宋体" w:hAnsi="Calibri" w:cs="Times New Roman"/>
                 <w:noProof/>
                 <w:kern w:val="0"/>
                 <w14:ligatures w14:val="none"/>
@@ -1300,7 +1300,7 @@
             <w:r>
               <w:rPr>
                 <w:rStyle w:val="af2"/>
-                <w:rFonts w:ascii="Calibri" w:eastAsia="宋体" w:hAnsi="Calibri" w:cs="Times New Roman" w:hint="eastAsia"/>
+                <w:rFonts w:ascii="Calibri" w:eastAsia="宋体" w:hAnsi="Calibri" w:cs="Times New Roman"/>
                 <w:noProof/>
                 <w:kern w:val="0"/>
                 <w14:ligatures w14:val="none"/>
@@ -1310,7 +1310,7 @@
             <w:r>
               <w:rPr>
                 <w:rStyle w:val="af2"/>
-                <w:rFonts w:ascii="Calibri" w:eastAsia="宋体" w:hAnsi="Calibri" w:cs="Times New Roman" w:hint="eastAsia"/>
+                <w:rFonts w:ascii="Calibri" w:eastAsia="宋体" w:hAnsi="Calibri" w:cs="Times New Roman"/>
                 <w:noProof/>
                 <w:kern w:val="0"/>
                 <w14:ligatures w14:val="none"/>
@@ -1346,7 +1346,7 @@
                 <w:noProof/>
                 <w:webHidden/>
               </w:rPr>
-              <w:instrText>PAGEREF _Toc215496971 \h</w:instrText>
+              <w:instrText>PAGEREF _Toc228177781 \h</w:instrText>
             </w:r>
             <w:r>
               <w:rPr>
@@ -1391,6 +1391,150 @@
         </w:p>
         <w:p>
           <w:pPr>
+            <w:pStyle w:val="TOC1"/>
+            <w:tabs>
+              <w:tab w:val="right" w:leader="dot" w:pos="8296"/>
+            </w:tabs>
+            <w:rPr>
+              <w:rFonts w:hint="eastAsia"/>
+              <w:noProof/>
+            </w:rPr>
+          </w:pPr>
+          <w:hyperlink w:anchor="_Toc228177782" w:history="1">
+            <w:r>
+              <w:rPr>
+                <w:rStyle w:val="af2"/>
+                <w:rFonts w:ascii="Calibri" w:eastAsia="宋体" w:hAnsi="Calibri" w:cs="Times New Roman"/>
+                <w:noProof/>
+                <w:kern w:val="0"/>
+                <w14:ligatures w14:val="none"/>
+              </w:rPr>
+              <w:t>以西结书（第</w:t>
+            </w:r>
+            <w:r>
+              <w:rPr>
+                <w:rStyle w:val="af2"/>
+                <w:rFonts w:ascii="Calibri" w:eastAsia="宋体" w:hAnsi="Calibri" w:cs="Times New Roman"/>
+                <w:noProof/>
+                <w:kern w:val="0"/>
+                <w14:ligatures w14:val="none"/>
+              </w:rPr>
+              <w:t>1</w:t>
+            </w:r>
+            <w:r>
+              <w:rPr>
+                <w:rStyle w:val="af2"/>
+                <w:rFonts w:ascii="Calibri" w:eastAsia="宋体" w:hAnsi="Calibri" w:cs="Times New Roman"/>
+                <w:noProof/>
+                <w:kern w:val="0"/>
+                <w14:ligatures w14:val="none"/>
+              </w:rPr>
+              <w:t>6</w:t>
+            </w:r>
+            <w:r>
+              <w:rPr>
+                <w:rStyle w:val="af2"/>
+                <w:rFonts w:ascii="Calibri" w:eastAsia="宋体" w:hAnsi="Calibri" w:cs="Times New Roman"/>
+                <w:noProof/>
+                <w:kern w:val="0"/>
+                <w14:ligatures w14:val="none"/>
+              </w:rPr>
+              <w:t>章）</w:t>
+            </w:r>
+            <w:r>
+              <w:rPr>
+                <w:rStyle w:val="af2"/>
+                <w:rFonts w:ascii="Calibri" w:eastAsia="宋体" w:hAnsi="Calibri" w:cs="Times New Roman"/>
+                <w:noProof/>
+                <w:kern w:val="0"/>
+                <w14:ligatures w14:val="none"/>
+              </w:rPr>
+              <w:t>~</w:t>
+            </w:r>
+            <w:r>
+              <w:rPr>
+                <w:rStyle w:val="af2"/>
+                <w:rFonts w:ascii="Calibri" w:eastAsia="宋体" w:hAnsi="Calibri" w:cs="Times New Roman"/>
+                <w:noProof/>
+                <w:kern w:val="0"/>
+                <w14:ligatures w14:val="none"/>
+              </w:rPr>
+              <w:t>以色列成为妓女</w:t>
+            </w:r>
+            <w:r>
+              <w:rPr>
+                <w:rFonts w:hint="eastAsia"/>
+                <w:noProof/>
+                <w:webHidden/>
+              </w:rPr>
+              <w:tab/>
+            </w:r>
+            <w:r>
+              <w:rPr>
+                <w:rFonts w:hint="eastAsia"/>
+                <w:noProof/>
+                <w:webHidden/>
+              </w:rPr>
+              <w:fldChar w:fldCharType="begin"/>
+            </w:r>
+            <w:r>
+              <w:rPr>
+                <w:rFonts w:hint="eastAsia"/>
+                <w:noProof/>
+                <w:webHidden/>
+              </w:rPr>
+              <w:instrText xml:space="preserve"> </w:instrText>
+            </w:r>
+            <w:r>
+              <w:rPr>
+                <w:noProof/>
+                <w:webHidden/>
+              </w:rPr>
+              <w:instrText>PAGEREF _Toc228177782 \h</w:instrText>
+            </w:r>
+            <w:r>
+              <w:rPr>
+                <w:rFonts w:hint="eastAsia"/>
+                <w:noProof/>
+                <w:webHidden/>
+              </w:rPr>
+              <w:instrText xml:space="preserve"> </w:instrText>
+            </w:r>
+            <w:r>
+              <w:rPr>
+                <w:rFonts w:hint="eastAsia"/>
+                <w:noProof/>
+                <w:webHidden/>
+              </w:rPr>
+            </w:r>
+            <w:r>
+              <w:rPr>
+                <w:rFonts w:hint="eastAsia"/>
+                <w:noProof/>
+                <w:webHidden/>
+              </w:rPr>
+              <w:fldChar w:fldCharType="separate"/>
+            </w:r>
+            <w:r>
+              <w:rPr>
+                <w:rFonts w:hint="eastAsia"/>
+                <w:noProof/>
+                <w:webHidden/>
+              </w:rPr>
+              <w:t>32</w:t>
+            </w:r>
+            <w:r>
+              <w:rPr>
+                <w:rFonts w:hint="eastAsia"/>
+                <w:noProof/>
+                <w:webHidden/>
+              </w:rPr>
+              <w:fldChar w:fldCharType="end"/>
+            </w:r>
+          </w:hyperlink>
+        </w:p>
+        <w:p>
+          <w:pPr>
             <w:rPr>
               <w:rFonts w:hint="eastAsia"/>
             </w:rPr>
@@ -1449,7 +1593,7 @@
           <w14:ligatures w14:val="none"/>
         </w:rPr>
       </w:pPr>
-      <w:bookmarkStart w:id="0" w:name="_Toc215496962"/>
+      <w:bookmarkStart w:id="0" w:name="_Toc228177772"/>
       <w:r>
         <w:rPr>
           <w:rFonts w:ascii="Calibri" w:eastAsia="宋体" w:hAnsi="Calibri" w:cs="Times New Roman" w:hint="eastAsia"/>
@@ -4349,7 +4493,7 @@
           <w14:ligatures w14:val="none"/>
         </w:rPr>
       </w:pPr>
-      <w:bookmarkStart w:id="2" w:name="_Toc215496963"/>
+      <w:bookmarkStart w:id="2" w:name="_Toc228177773"/>
       <w:r>
         <w:rPr>
           <w:rFonts w:ascii="Calibri" w:eastAsia="宋体" w:hAnsi="Calibri" w:cs="Times New Roman" w:hint="eastAsia"/>
@@ -6720,7 +6864,7 @@
           <w14:ligatures w14:val="none"/>
         </w:rPr>
       </w:pPr>
-      <w:bookmarkStart w:id="3" w:name="_Toc215496964"/>
+      <w:bookmarkStart w:id="3" w:name="_Toc228177774"/>
       <w:r>
         <w:rPr>
           <w:rFonts w:ascii="Calibri" w:eastAsia="宋体" w:hAnsi="Calibri" w:cs="Times New Roman" w:hint="eastAsia"/>
@@ -8617,7 +8761,7 @@
           <w14:ligatures w14:val="none"/>
         </w:rPr>
       </w:pPr>
-      <w:bookmarkStart w:id="4" w:name="_Toc215496965"/>
+      <w:bookmarkStart w:id="4" w:name="_Toc228177775"/>
       <w:r>
         <w:rPr>
           <w:rFonts w:ascii="Calibri" w:eastAsia="宋体" w:hAnsi="Calibri" w:cs="Times New Roman" w:hint="eastAsia"/>
@@ -10534,7 +10678,7 @@
           <w14:ligatures w14:val="none"/>
         </w:rPr>
       </w:pPr>
-      <w:bookmarkStart w:id="5" w:name="_Toc215496966"/>
+      <w:bookmarkStart w:id="5" w:name="_Toc228177776"/>
       <w:r>
         <w:rPr>
           <w:rFonts w:ascii="Calibri" w:eastAsia="宋体" w:hAnsi="Calibri" w:cs="Times New Roman" w:hint="eastAsia"/>
@@ -13423,7 +13567,7 @@
         </w:rPr>
         <w:br w:type="page"/>
       </w:r>
-      <w:bookmarkStart w:id="6" w:name="_Toc215496967"/>
+      <w:bookmarkStart w:id="6" w:name="_Toc228177777"/>
       <w:r>
         <w:rPr>
           <w:rFonts w:ascii="Calibri" w:eastAsia="宋体" w:hAnsi="Calibri" w:cs="Times New Roman" w:hint="eastAsia"/>
@@ -14667,6 +14811,7 @@
           <w:sz w:val="24"/>
           <w14:ligatures w14:val="none"/>
         </w:rPr>
+        <w:lastRenderedPageBreak/>
         <w:t xml:space="preserve">3）神的荣耀在祂的诫命中彰显（林后3:7） </w:t>
       </w:r>
     </w:p>
@@ -14695,7 +14840,6 @@
           <w:sz w:val="24"/>
           <w14:ligatures w14:val="none"/>
         </w:rPr>
-        <w:lastRenderedPageBreak/>
         <w:t xml:space="preserve"> </w:t>
       </w:r>
       <w:r>
@@ -15775,7 +15919,18 @@
           <w:sz w:val="24"/>
           <w14:ligatures w14:val="none"/>
         </w:rPr>
-        <w:t>我们从前将我们主耶稣基督的大能和他降临的事告诉你们，并不是随从乖巧捏造的虚言，乃是亲眼见过他的威荣。他从父　神得尊贵荣耀的时候，从极大荣光之中有声音出来，向他说：这是我的爱子，我所喜悦的。”我们同他在圣山的时候，亲自听见这声音从天上出来。</w:t>
+        <w:t>我们从前将我们主耶稣基督的大能和他降临的事告诉你们，并不是随从乖巧捏造的虚言，乃是亲眼见过他的威荣。他从父　神得尊贵荣耀的时候，从极大</w:t>
+      </w:r>
+      <w:r>
+        <w:rPr>
+          <w:rFonts w:ascii="宋体" w:eastAsia="宋体" w:hAnsi="宋体" w:cs="Times New Roman" w:hint="eastAsia"/>
+          <w:color w:val="000000"/>
+          <w:kern w:val="0"/>
+          <w:sz w:val="24"/>
+          <w14:ligatures w14:val="none"/>
+        </w:rPr>
+        <w:lastRenderedPageBreak/>
+        <w:t>荣光之中有声音出来，向他说：这是我的爱子，我所喜悦的。”我们同他在圣山的时候，亲自听见这声音从天上出来。</w:t>
       </w:r>
       <w:r>
         <w:rPr>
@@ -15836,7 +15991,6 @@
           <w:sz w:val="24"/>
           <w14:ligatures w14:val="none"/>
         </w:rPr>
-        <w:lastRenderedPageBreak/>
         <w:t>二、</w:t>
       </w:r>
       <w:r>
@@ -17003,7 +17157,7 @@
           <w14:ligatures w14:val="none"/>
         </w:rPr>
       </w:pPr>
-      <w:bookmarkStart w:id="7" w:name="_Toc215496968"/>
+      <w:bookmarkStart w:id="7" w:name="_Toc228177778"/>
       <w:r>
         <w:rPr>
           <w:rFonts w:ascii="Calibri" w:eastAsia="宋体" w:hAnsi="Calibri" w:cs="Times New Roman" w:hint="eastAsia"/>
@@ -19534,7 +19688,7 @@
           <w14:ligatures w14:val="none"/>
         </w:rPr>
       </w:pPr>
-      <w:bookmarkStart w:id="8" w:name="_Toc215496969"/>
+      <w:bookmarkStart w:id="8" w:name="_Toc228177779"/>
       <w:r>
         <w:rPr>
           <w:rFonts w:ascii="Calibri" w:eastAsia="宋体" w:hAnsi="Calibri" w:cs="Times New Roman" w:hint="eastAsia"/>
@@ -21534,7 +21688,7 @@
           <w14:ligatures w14:val="none"/>
         </w:rPr>
       </w:pPr>
-      <w:bookmarkStart w:id="9" w:name="_Toc215496970"/>
+      <w:bookmarkStart w:id="9" w:name="_Toc228177780"/>
       <w:r>
         <w:rPr>
           <w:rFonts w:ascii="Calibri" w:eastAsia="宋体" w:hAnsi="Calibri" w:cs="Times New Roman" w:hint="eastAsia"/>
@@ -23155,7 +23309,7 @@
           <w14:ligatures w14:val="none"/>
         </w:rPr>
       </w:pPr>
-      <w:bookmarkStart w:id="10" w:name="_Toc215496971"/>
+      <w:bookmarkStart w:id="10" w:name="_Toc228177781"/>
       <w:r>
         <w:rPr>
           <w:rFonts w:ascii="Calibri" w:eastAsia="宋体" w:hAnsi="Calibri" w:cs="Times New Roman" w:hint="eastAsia"/>
@@ -24851,19 +25005,1913 @@
     <w:p>
       <w:pPr>
         <w:widowControl/>
-        <w:tabs>
-          <w:tab w:val="left" w:pos="420"/>
-        </w:tabs>
-        <w:spacing w:after="120" w:line="257" w:lineRule="auto"/>
-        <w:jc w:val="both"/>
-        <w:rPr>
-          <w:rFonts w:ascii="宋体" w:eastAsia="宋体" w:hAnsi="宋体" w:cs="Times New Roman" w:hint="eastAsia"/>
-          <w:color w:val="000000"/>
-          <w:kern w:val="0"/>
-          <w:sz w:val="24"/>
-          <w14:ligatures w14:val="none"/>
-        </w:rPr>
-      </w:pPr>
+        <w:rPr>
+          <w:rFonts w:ascii="宋体" w:eastAsia="宋体" w:hAnsi="宋体" w:cs="Times New Roman" w:hint="eastAsia"/>
+          <w:color w:val="000000"/>
+          <w:kern w:val="0"/>
+          <w:sz w:val="24"/>
+          <w14:ligatures w14:val="none"/>
+        </w:rPr>
+      </w:pPr>
+      <w:r>
+        <w:rPr>
+          <w:rFonts w:ascii="宋体" w:eastAsia="宋体" w:hAnsi="宋体" w:cs="Times New Roman" w:hint="eastAsia"/>
+          <w:color w:val="000000"/>
+          <w:kern w:val="0"/>
+          <w:sz w:val="24"/>
+          <w14:ligatures w14:val="none"/>
+        </w:rPr>
+        <w:br w:type="page"/>
+      </w:r>
+    </w:p>
+    <w:p>
+      <w:pPr>
+        <w:keepNext/>
+        <w:keepLines/>
+        <w:widowControl/>
+        <w:pBdr>
+          <w:bottom w:val="single" w:sz="12" w:space="12" w:color="56152F"/>
+        </w:pBdr>
+        <w:spacing w:before="460" w:after="480" w:line="256" w:lineRule="auto"/>
+        <w:outlineLvl w:val="0"/>
+        <w:rPr>
+          <w:rFonts w:ascii="Calibri" w:eastAsia="宋体" w:hAnsi="Calibri" w:cs="Times New Roman"/>
+          <w:color w:val="731C3F"/>
+          <w:kern w:val="0"/>
+          <w:sz w:val="40"/>
+          <w:szCs w:val="32"/>
+          <w14:ligatures w14:val="none"/>
+        </w:rPr>
+      </w:pPr>
+      <w:bookmarkStart w:id="11" w:name="_Toc228177782"/>
+      <w:r>
+        <w:rPr>
+          <w:rFonts w:ascii="Calibri" w:eastAsia="宋体" w:hAnsi="Calibri" w:cs="Times New Roman" w:hint="eastAsia"/>
+          <w:color w:val="731C3F"/>
+          <w:kern w:val="0"/>
+          <w:sz w:val="40"/>
+          <w:szCs w:val="32"/>
+          <w14:ligatures w14:val="none"/>
+        </w:rPr>
+        <w:lastRenderedPageBreak/>
+        <w:t>以西结书</w:t>
+      </w:r>
+      <w:r>
+        <w:rPr>
+          <w:rFonts w:ascii="Calibri" w:eastAsia="宋体" w:hAnsi="Calibri" w:cs="Times New Roman" w:hint="eastAsia"/>
+          <w:color w:val="731C3F"/>
+          <w:kern w:val="0"/>
+          <w:sz w:val="40"/>
+          <w:szCs w:val="32"/>
+          <w14:ligatures w14:val="none"/>
+        </w:rPr>
+        <w:t>（</w:t>
+      </w:r>
+      <w:r>
+        <w:rPr>
+          <w:rFonts w:ascii="Calibri" w:eastAsia="宋体" w:hAnsi="Calibri" w:cs="Times New Roman" w:hint="eastAsia"/>
+          <w:color w:val="731C3F"/>
+          <w:kern w:val="0"/>
+          <w:sz w:val="40"/>
+          <w:szCs w:val="32"/>
+          <w14:ligatures w14:val="none"/>
+        </w:rPr>
+        <w:t>第</w:t>
+      </w:r>
+      <w:r>
+        <w:rPr>
+          <w:rFonts w:ascii="Calibri" w:eastAsia="宋体" w:hAnsi="Calibri" w:cs="Times New Roman" w:hint="eastAsia"/>
+          <w:color w:val="731C3F"/>
+          <w:kern w:val="0"/>
+          <w:sz w:val="40"/>
+          <w:szCs w:val="32"/>
+          <w14:ligatures w14:val="none"/>
+        </w:rPr>
+        <w:t>16</w:t>
+      </w:r>
+      <w:r>
+        <w:rPr>
+          <w:rFonts w:ascii="Calibri" w:eastAsia="宋体" w:hAnsi="Calibri" w:cs="Times New Roman" w:hint="eastAsia"/>
+          <w:color w:val="731C3F"/>
+          <w:kern w:val="0"/>
+          <w:sz w:val="40"/>
+          <w:szCs w:val="32"/>
+          <w14:ligatures w14:val="none"/>
+        </w:rPr>
+        <w:t>章</w:t>
+      </w:r>
+      <w:r>
+        <w:rPr>
+          <w:rFonts w:ascii="Calibri" w:eastAsia="宋体" w:hAnsi="Calibri" w:cs="Times New Roman" w:hint="eastAsia"/>
+          <w:color w:val="731C3F"/>
+          <w:kern w:val="0"/>
+          <w:sz w:val="40"/>
+          <w:szCs w:val="32"/>
+          <w14:ligatures w14:val="none"/>
+        </w:rPr>
+        <w:t>）</w:t>
+      </w:r>
+      <w:r>
+        <w:rPr>
+          <w:rFonts w:ascii="Calibri" w:eastAsia="宋体" w:hAnsi="Calibri" w:cs="Times New Roman"/>
+          <w:color w:val="731C3F"/>
+          <w:kern w:val="0"/>
+          <w:sz w:val="40"/>
+          <w:szCs w:val="32"/>
+          <w14:ligatures w14:val="none"/>
+        </w:rPr>
+        <w:t>~</w:t>
+      </w:r>
+      <w:r>
+        <w:rPr>
+          <w:rFonts w:ascii="Calibri" w:eastAsia="宋体" w:hAnsi="Calibri" w:cs="Times New Roman" w:hint="eastAsia"/>
+          <w:color w:val="731C3F"/>
+          <w:kern w:val="0"/>
+          <w:sz w:val="40"/>
+          <w:szCs w:val="32"/>
+          <w14:ligatures w14:val="none"/>
+        </w:rPr>
+        <w:t>以色列成为妓女</w:t>
+      </w:r>
+      <w:bookmarkEnd w:id="11"/>
+    </w:p>
+    <w:p>
+      <w:pPr>
+        <w:widowControl/>
+        <w:tabs>
+          <w:tab w:val="left" w:pos="420"/>
+        </w:tabs>
+        <w:spacing w:after="120" w:line="256" w:lineRule="auto"/>
+        <w:ind w:left="432" w:hanging="432"/>
+        <w:jc w:val="both"/>
+        <w:rPr>
+          <w:rFonts w:ascii="宋体" w:eastAsia="宋体" w:hAnsi="宋体" w:cs="Times New Roman" w:hint="eastAsia"/>
+          <w:color w:val="000000"/>
+          <w:kern w:val="0"/>
+          <w:sz w:val="24"/>
+          <w14:ligatures w14:val="none"/>
+        </w:rPr>
+      </w:pPr>
+      <w:r>
+        <w:rPr>
+          <w:rFonts w:ascii="宋体" w:eastAsia="宋体" w:hAnsi="宋体" w:cs="Times New Roman" w:hint="eastAsia"/>
+          <w:color w:val="000000"/>
+          <w:kern w:val="0"/>
+          <w:sz w:val="24"/>
+          <w14:ligatures w14:val="none"/>
+        </w:rPr>
+        <w:t>时间</w:t>
+      </w:r>
+      <w:r>
+        <w:rPr>
+          <w:rFonts w:ascii="宋体" w:eastAsia="宋体" w:hAnsi="宋体" w:cs="Times New Roman" w:hint="eastAsia"/>
+          <w:color w:val="000000"/>
+          <w:kern w:val="0"/>
+          <w:sz w:val="24"/>
+          <w14:ligatures w14:val="none"/>
+        </w:rPr>
+        <w:t>：</w:t>
+      </w:r>
+      <w:r>
+        <w:rPr>
+          <w:rFonts w:ascii="宋体" w:eastAsia="宋体" w:hAnsi="宋体" w:cs="Times New Roman" w:hint="eastAsia"/>
+          <w:color w:val="000000"/>
+          <w:kern w:val="0"/>
+          <w:sz w:val="24"/>
+          <w14:ligatures w14:val="none"/>
+        </w:rPr>
+        <w:t>202</w:t>
+      </w:r>
+      <w:r>
+        <w:rPr>
+          <w:rFonts w:ascii="宋体" w:eastAsia="宋体" w:hAnsi="宋体" w:cs="Times New Roman" w:hint="eastAsia"/>
+          <w:color w:val="000000"/>
+          <w:kern w:val="0"/>
+          <w:sz w:val="24"/>
+          <w14:ligatures w14:val="none"/>
+        </w:rPr>
+        <w:t>6</w:t>
+      </w:r>
+      <w:r>
+        <w:rPr>
+          <w:rFonts w:ascii="宋体" w:eastAsia="宋体" w:hAnsi="宋体" w:cs="Times New Roman" w:hint="eastAsia"/>
+          <w:color w:val="000000"/>
+          <w:kern w:val="0"/>
+          <w:sz w:val="24"/>
+          <w14:ligatures w14:val="none"/>
+        </w:rPr>
+        <w:t>年</w:t>
+      </w:r>
+      <w:r>
+        <w:rPr>
+          <w:rFonts w:ascii="宋体" w:eastAsia="宋体" w:hAnsi="宋体" w:cs="Times New Roman" w:hint="eastAsia"/>
+          <w:color w:val="000000"/>
+          <w:kern w:val="0"/>
+          <w:sz w:val="24"/>
+          <w14:ligatures w14:val="none"/>
+        </w:rPr>
+        <w:t>4</w:t>
+      </w:r>
+      <w:r>
+        <w:rPr>
+          <w:rFonts w:ascii="宋体" w:eastAsia="宋体" w:hAnsi="宋体" w:cs="Times New Roman" w:hint="eastAsia"/>
+          <w:color w:val="000000"/>
+          <w:kern w:val="0"/>
+          <w:sz w:val="24"/>
+          <w14:ligatures w14:val="none"/>
+        </w:rPr>
+        <w:t>月</w:t>
+      </w:r>
+      <w:r>
+        <w:rPr>
+          <w:rFonts w:ascii="宋体" w:eastAsia="宋体" w:hAnsi="宋体" w:cs="Times New Roman" w:hint="eastAsia"/>
+          <w:color w:val="000000"/>
+          <w:kern w:val="0"/>
+          <w:sz w:val="24"/>
+          <w14:ligatures w14:val="none"/>
+        </w:rPr>
+        <w:t>22</w:t>
+      </w:r>
+      <w:r>
+        <w:rPr>
+          <w:rFonts w:ascii="宋体" w:eastAsia="宋体" w:hAnsi="宋体" w:cs="Times New Roman" w:hint="eastAsia"/>
+          <w:color w:val="000000"/>
+          <w:kern w:val="0"/>
+          <w:sz w:val="24"/>
+          <w14:ligatures w14:val="none"/>
+        </w:rPr>
+        <w:t>日</w:t>
+      </w:r>
+    </w:p>
+    <w:p>
+      <w:pPr>
+        <w:widowControl/>
+        <w:tabs>
+          <w:tab w:val="left" w:pos="420"/>
+        </w:tabs>
+        <w:spacing w:after="120" w:line="256" w:lineRule="auto"/>
+        <w:ind w:left="432" w:hanging="432"/>
+        <w:jc w:val="both"/>
+        <w:rPr>
+          <w:rFonts w:ascii="宋体" w:eastAsia="宋体" w:hAnsi="宋体" w:cs="Times New Roman" w:hint="eastAsia"/>
+          <w:color w:val="000000"/>
+          <w:kern w:val="0"/>
+          <w:sz w:val="24"/>
+          <w14:ligatures w14:val="none"/>
+        </w:rPr>
+      </w:pPr>
+      <w:r>
+        <w:rPr>
+          <w:rFonts w:ascii="宋体" w:eastAsia="宋体" w:hAnsi="宋体" w:cs="Times New Roman" w:hint="eastAsia"/>
+          <w:color w:val="000000"/>
+          <w:kern w:val="0"/>
+          <w:sz w:val="24"/>
+          <w14:ligatures w14:val="none"/>
+        </w:rPr>
+        <w:t>相关经文：以西结书</w:t>
+      </w:r>
+      <w:r>
+        <w:rPr>
+          <w:rFonts w:ascii="宋体" w:eastAsia="宋体" w:hAnsi="宋体" w:cs="Times New Roman" w:hint="eastAsia"/>
+          <w:color w:val="000000"/>
+          <w:kern w:val="0"/>
+          <w:sz w:val="24"/>
+          <w14:ligatures w14:val="none"/>
+        </w:rPr>
+        <w:t>16</w:t>
+      </w:r>
+    </w:p>
+    <w:p>
+      <w:pPr>
+        <w:widowControl/>
+        <w:tabs>
+          <w:tab w:val="left" w:pos="420"/>
+        </w:tabs>
+        <w:spacing w:after="120" w:line="257" w:lineRule="auto"/>
+        <w:jc w:val="both"/>
+        <w:rPr>
+          <w:rFonts w:ascii="宋体" w:eastAsia="宋体" w:hAnsi="宋体" w:cs="Times New Roman" w:hint="eastAsia"/>
+          <w:color w:val="000000"/>
+          <w:kern w:val="0"/>
+          <w:sz w:val="24"/>
+          <w14:ligatures w14:val="none"/>
+        </w:rPr>
+      </w:pPr>
+      <w:r>
+        <w:rPr>
+          <w:rFonts w:ascii="宋体" w:eastAsia="宋体" w:hAnsi="宋体" w:cs="Times New Roman" w:hint="eastAsia"/>
+          <w:color w:val="000000"/>
+          <w:kern w:val="0"/>
+          <w:sz w:val="24"/>
+          <w14:ligatures w14:val="none"/>
+        </w:rPr>
+        <w:t>以西结的名字意为“神的能力”，神用以西结提醒是神赐给你我能力。「以西结书」完整讲述了以色列的过去、现在以及将来。主前597年以西结被掳到巴比伦，主前592年神呼召以西结成为祂的见证人写作这本书，当时犹太国还没有被灭国（主前586年犹太国被灭）。神让以西结向被掳到巴比伦的犹太人</w:t>
+      </w:r>
+      <w:r>
+        <w:rPr>
+          <w:rFonts w:ascii="宋体" w:eastAsia="宋体" w:hAnsi="宋体" w:cs="Times New Roman" w:hint="eastAsia"/>
+          <w:color w:val="000000"/>
+          <w:kern w:val="0"/>
+          <w:sz w:val="24"/>
+          <w14:ligatures w14:val="none"/>
+        </w:rPr>
+        <w:t>传讲对以色列的预言。</w:t>
+      </w:r>
+    </w:p>
+    <w:p>
+      <w:pPr>
+        <w:widowControl/>
+        <w:tabs>
+          <w:tab w:val="left" w:pos="420"/>
+        </w:tabs>
+        <w:spacing w:after="120" w:line="257" w:lineRule="auto"/>
+        <w:jc w:val="both"/>
+        <w:rPr>
+          <w:rFonts w:ascii="宋体" w:eastAsia="宋体" w:hAnsi="宋体" w:cs="Times New Roman" w:hint="eastAsia"/>
+          <w:b/>
+          <w:bCs/>
+          <w:color w:val="000000"/>
+          <w:kern w:val="0"/>
+          <w:sz w:val="24"/>
+          <w14:ligatures w14:val="none"/>
+        </w:rPr>
+      </w:pPr>
+      <w:r>
+        <w:rPr>
+          <w:rFonts w:ascii="宋体" w:eastAsia="宋体" w:hAnsi="宋体" w:cs="Times New Roman" w:hint="eastAsia"/>
+          <w:b/>
+          <w:bCs/>
+          <w:color w:val="000000"/>
+          <w:kern w:val="0"/>
+          <w:sz w:val="24"/>
+          <w14:ligatures w14:val="none"/>
+        </w:rPr>
+        <w:t>一、vv1-14  耶和华神对以色列表达爱的关系</w:t>
+      </w:r>
+    </w:p>
+    <w:p>
+      <w:pPr>
+        <w:widowControl/>
+        <w:tabs>
+          <w:tab w:val="left" w:pos="420"/>
+        </w:tabs>
+        <w:spacing w:after="120" w:line="257" w:lineRule="auto"/>
+        <w:jc w:val="both"/>
+        <w:rPr>
+          <w:rFonts w:ascii="宋体" w:eastAsia="宋体" w:hAnsi="宋体" w:cs="Times New Roman" w:hint="eastAsia"/>
+          <w:color w:val="000000"/>
+          <w:kern w:val="0"/>
+          <w:sz w:val="24"/>
+          <w14:ligatures w14:val="none"/>
+        </w:rPr>
+      </w:pPr>
+      <w:r>
+        <w:rPr>
+          <w:rFonts w:ascii="宋体" w:eastAsia="宋体" w:hAnsi="宋体" w:cs="Times New Roman" w:hint="eastAsia"/>
+          <w:color w:val="000000"/>
+          <w:kern w:val="0"/>
+          <w:sz w:val="24"/>
+          <w14:ligatures w14:val="none"/>
+        </w:rPr>
+        <w:t>神在世界中拣选以色列做祂的子民。</w:t>
+      </w:r>
+    </w:p>
+    <w:p>
+      <w:pPr>
+        <w:widowControl/>
+        <w:tabs>
+          <w:tab w:val="left" w:pos="420"/>
+        </w:tabs>
+        <w:spacing w:after="120" w:line="257" w:lineRule="auto"/>
+        <w:jc w:val="both"/>
+        <w:rPr>
+          <w:rFonts w:ascii="宋体" w:eastAsia="宋体" w:hAnsi="宋体" w:cs="Times New Roman" w:hint="eastAsia"/>
+          <w:color w:val="000000"/>
+          <w:kern w:val="0"/>
+          <w:sz w:val="24"/>
+          <w14:ligatures w14:val="none"/>
+        </w:rPr>
+      </w:pPr>
+      <w:r>
+        <w:rPr>
+          <w:rFonts w:ascii="宋体" w:eastAsia="宋体" w:hAnsi="宋体" w:cs="Times New Roman" w:hint="eastAsia"/>
+          <w:color w:val="000000"/>
+          <w:kern w:val="0"/>
+          <w:sz w:val="24"/>
+          <w14:ligatures w14:val="none"/>
+        </w:rPr>
+        <w:t>1、v2：神兴起以西结是为了“</w:t>
+      </w:r>
+      <w:r>
+        <w:rPr>
+          <w:rFonts w:ascii="宋体" w:eastAsia="宋体" w:hAnsi="宋体" w:cs="Times New Roman"/>
+          <w:color w:val="000000"/>
+          <w:kern w:val="0"/>
+          <w:sz w:val="24"/>
+          <w14:ligatures w14:val="none"/>
+        </w:rPr>
+        <w:t>使耶路撒冷知道她那些可憎的事</w:t>
+      </w:r>
+      <w:r>
+        <w:rPr>
+          <w:rFonts w:ascii="宋体" w:eastAsia="宋体" w:hAnsi="宋体" w:cs="Times New Roman" w:hint="eastAsia"/>
+          <w:color w:val="000000"/>
+          <w:kern w:val="0"/>
+          <w:sz w:val="24"/>
+          <w14:ligatures w14:val="none"/>
+        </w:rPr>
+        <w:t>”。“可憎的事情”出现了很多次，神把以色列比作自己的妻子，以色列是神创造的，神爱以色列。“耶路撒冷”在南国犹大地，神在这里用“耶路撒冷”指代整个以色列。</w:t>
+      </w:r>
+    </w:p>
+    <w:p>
+      <w:pPr>
+        <w:widowControl/>
+        <w:tabs>
+          <w:tab w:val="left" w:pos="420"/>
+        </w:tabs>
+        <w:spacing w:after="120" w:line="257" w:lineRule="auto"/>
+        <w:jc w:val="both"/>
+        <w:rPr>
+          <w:rFonts w:ascii="宋体" w:eastAsia="宋体" w:hAnsi="宋体" w:cs="Times New Roman" w:hint="eastAsia"/>
+          <w:color w:val="000000"/>
+          <w:kern w:val="0"/>
+          <w:sz w:val="24"/>
+          <w14:ligatures w14:val="none"/>
+        </w:rPr>
+      </w:pPr>
+      <w:r>
+        <w:rPr>
+          <w:rFonts w:ascii="宋体" w:eastAsia="宋体" w:hAnsi="宋体" w:cs="Times New Roman" w:hint="eastAsia"/>
+          <w:color w:val="000000"/>
+          <w:kern w:val="0"/>
+          <w:sz w:val="24"/>
+          <w14:ligatures w14:val="none"/>
+        </w:rPr>
+        <w:t>2、v3-7：神对以色列的怜悯。</w:t>
+      </w:r>
+    </w:p>
+    <w:p>
+      <w:pPr>
+        <w:widowControl/>
+        <w:tabs>
+          <w:tab w:val="left" w:pos="420"/>
+        </w:tabs>
+        <w:spacing w:after="120" w:line="257" w:lineRule="auto"/>
+        <w:jc w:val="both"/>
+        <w:rPr>
+          <w:rFonts w:ascii="宋体" w:eastAsia="宋体" w:hAnsi="宋体" w:cs="Times New Roman" w:hint="eastAsia"/>
+          <w:color w:val="000000"/>
+          <w:kern w:val="0"/>
+          <w:sz w:val="24"/>
+          <w14:ligatures w14:val="none"/>
+        </w:rPr>
+      </w:pPr>
+      <w:r>
+        <w:rPr>
+          <w:rFonts w:ascii="宋体" w:eastAsia="宋体" w:hAnsi="宋体" w:cs="Times New Roman" w:hint="eastAsia"/>
+          <w:color w:val="000000"/>
+          <w:kern w:val="0"/>
+          <w:sz w:val="24"/>
+          <w14:ligatures w14:val="none"/>
+        </w:rPr>
+        <w:t>v3-5</w:t>
+      </w:r>
+      <w:r>
+        <w:rPr>
+          <w:rFonts w:ascii="宋体" w:eastAsia="宋体" w:hAnsi="宋体" w:cs="Times New Roman" w:hint="eastAsia"/>
+          <w:color w:val="000000"/>
+          <w:kern w:val="0"/>
+          <w:sz w:val="24"/>
+          <w14:ligatures w14:val="none"/>
+        </w:rPr>
+        <w:t>“</w:t>
+      </w:r>
+      <w:r>
+        <w:rPr>
+          <w:rFonts w:ascii="宋体" w:eastAsia="宋体" w:hAnsi="宋体" w:cs="Times New Roman"/>
+          <w:color w:val="000000"/>
+          <w:kern w:val="0"/>
+          <w:sz w:val="24"/>
+          <w14:ligatures w14:val="none"/>
+        </w:rPr>
+        <w:t>你根本，你出世，是在迦南地；</w:t>
+      </w:r>
+      <w:r>
+        <w:rPr>
+          <w:rFonts w:ascii="宋体" w:eastAsia="宋体" w:hAnsi="宋体" w:cs="Times New Roman" w:hint="eastAsia"/>
+          <w:color w:val="000000"/>
+          <w:kern w:val="0"/>
+          <w:sz w:val="24"/>
+          <w14:ligatures w14:val="none"/>
+        </w:rPr>
+        <w:t>”迦南地是神给犹太人人的，也就是现在的 “巴勒斯坦”，说以色列占领这块巴勒斯坦人的土地，这是错误的。</w:t>
+      </w:r>
+    </w:p>
+    <w:p>
+      <w:pPr>
+        <w:widowControl/>
+        <w:tabs>
+          <w:tab w:val="left" w:pos="420"/>
+        </w:tabs>
+        <w:spacing w:after="120" w:line="257" w:lineRule="auto"/>
+        <w:ind w:leftChars="100" w:left="220"/>
+        <w:jc w:val="both"/>
+        <w:rPr>
+          <w:rFonts w:ascii="楷体" w:eastAsia="楷体" w:hAnsi="楷体" w:cs="Times New Roman" w:hint="eastAsia"/>
+          <w:color w:val="000000"/>
+          <w:kern w:val="0"/>
+          <w:sz w:val="24"/>
+          <w14:ligatures w14:val="none"/>
+        </w:rPr>
+      </w:pPr>
+      <w:r>
+        <w:rPr>
+          <w:rFonts w:ascii="楷体" w:eastAsia="楷体" w:hAnsi="楷体" w:cs="Times New Roman" w:hint="eastAsia"/>
+          <w:color w:val="000000"/>
+          <w:kern w:val="0"/>
+          <w:sz w:val="24"/>
+          <w14:ligatures w14:val="none"/>
+        </w:rPr>
+        <w:t>「创世纪12:1，6」：“</w:t>
+      </w:r>
+      <w:r>
+        <w:rPr>
+          <w:rFonts w:ascii="楷体" w:eastAsia="楷体" w:hAnsi="楷体" w:cs="Times New Roman"/>
+          <w:color w:val="000000"/>
+          <w:kern w:val="0"/>
+          <w:sz w:val="24"/>
+          <w14:ligatures w14:val="none"/>
+        </w:rPr>
+        <w:t>耶和华对亚伯兰说：「你要离开本地、本族、父家，往我所要指示你的地去。</w:t>
+      </w:r>
+      <w:r>
+        <w:rPr>
+          <w:rFonts w:ascii="楷体" w:eastAsia="楷体" w:hAnsi="楷体" w:cs="Times New Roman" w:hint="eastAsia"/>
+          <w:color w:val="000000"/>
+          <w:kern w:val="0"/>
+          <w:sz w:val="24"/>
+          <w14:ligatures w14:val="none"/>
+        </w:rPr>
+        <w:t>……</w:t>
+      </w:r>
+      <w:r>
+        <w:rPr>
+          <w:rFonts w:ascii="楷体" w:eastAsia="楷体" w:hAnsi="楷体" w:cs="Times New Roman"/>
+          <w:color w:val="000000"/>
+          <w:kern w:val="0"/>
+          <w:sz w:val="24"/>
+          <w14:ligatures w14:val="none"/>
+        </w:rPr>
+        <w:t>亚伯兰经过那地，到了示剑地方、摩利橡树那里。那时迦南人住在那地。</w:t>
+      </w:r>
+      <w:r>
+        <w:rPr>
+          <w:rFonts w:ascii="楷体" w:eastAsia="楷体" w:hAnsi="楷体" w:cs="Times New Roman" w:hint="eastAsia"/>
+          <w:color w:val="000000"/>
+          <w:kern w:val="0"/>
+          <w:sz w:val="24"/>
+          <w14:ligatures w14:val="none"/>
+        </w:rPr>
+        <w:t>”</w:t>
+      </w:r>
+    </w:p>
+    <w:p>
+      <w:pPr>
+        <w:widowControl/>
+        <w:tabs>
+          <w:tab w:val="left" w:pos="420"/>
+        </w:tabs>
+        <w:spacing w:after="120" w:line="257" w:lineRule="auto"/>
+        <w:jc w:val="both"/>
+        <w:rPr>
+          <w:rFonts w:ascii="宋体" w:eastAsia="宋体" w:hAnsi="宋体" w:cs="Times New Roman" w:hint="eastAsia"/>
+          <w:color w:val="000000"/>
+          <w:kern w:val="0"/>
+          <w:sz w:val="24"/>
+          <w14:ligatures w14:val="none"/>
+        </w:rPr>
+      </w:pPr>
+      <w:r>
+        <w:rPr>
+          <w:rFonts w:ascii="宋体" w:eastAsia="宋体" w:hAnsi="宋体" w:cs="Times New Roman" w:hint="eastAsia"/>
+          <w:color w:val="000000"/>
+          <w:kern w:val="0"/>
+          <w:sz w:val="24"/>
+          <w14:ligatures w14:val="none"/>
+        </w:rPr>
+        <w:t>神描述怎样从邪恶的迦南人手里拯救以色列。</w:t>
+      </w:r>
+      <w:r>
+        <w:rPr>
+          <w:rFonts w:ascii="宋体" w:eastAsia="宋体" w:hAnsi="宋体" w:cs="Times New Roman" w:hint="eastAsia"/>
+          <w:color w:val="000000"/>
+          <w:kern w:val="0"/>
+          <w:sz w:val="24"/>
+          <w14:ligatures w14:val="none"/>
+        </w:rPr>
+        <w:t>神曾吩咐以色列人灭掉迦南人，因为他们在神面前行了“可憎恶的事”。</w:t>
+      </w:r>
+    </w:p>
+    <w:p>
+      <w:pPr>
+        <w:widowControl/>
+        <w:tabs>
+          <w:tab w:val="left" w:pos="420"/>
+        </w:tabs>
+        <w:spacing w:after="120" w:line="257" w:lineRule="auto"/>
+        <w:ind w:leftChars="100" w:left="220"/>
+        <w:jc w:val="both"/>
+        <w:rPr>
+          <w:rFonts w:ascii="楷体" w:eastAsia="楷体" w:hAnsi="楷体" w:cs="Times New Roman" w:hint="eastAsia"/>
+          <w:color w:val="000000"/>
+          <w:kern w:val="0"/>
+          <w:sz w:val="24"/>
+          <w14:ligatures w14:val="none"/>
+        </w:rPr>
+      </w:pPr>
+      <w:r>
+        <w:rPr>
+          <w:rFonts w:ascii="楷体" w:eastAsia="楷体" w:hAnsi="楷体" w:cs="Times New Roman" w:hint="eastAsia"/>
+          <w:color w:val="000000"/>
+          <w:kern w:val="0"/>
+          <w:sz w:val="24"/>
+          <w14:ligatures w14:val="none"/>
+        </w:rPr>
+        <w:t>「申命记20:17-18」</w:t>
+      </w:r>
+      <w:r>
+        <w:rPr>
+          <w:rFonts w:ascii="楷体" w:eastAsia="楷体" w:hAnsi="楷体" w:cs="Times New Roman" w:hint="eastAsia"/>
+          <w:color w:val="000000"/>
+          <w:kern w:val="0"/>
+          <w:sz w:val="24"/>
+          <w14:ligatures w14:val="none"/>
+        </w:rPr>
+        <w:t>：“</w:t>
+      </w:r>
+      <w:r>
+        <w:rPr>
+          <w:rFonts w:ascii="楷体" w:eastAsia="楷体" w:hAnsi="楷体" w:cs="Times New Roman"/>
+          <w:color w:val="000000"/>
+          <w:kern w:val="0"/>
+          <w:sz w:val="24"/>
+          <w14:ligatures w14:val="none"/>
+        </w:rPr>
+        <w:t>只要照耶和华－你　神所吩咐的将这赫人、亚摩利人、迦南人、比利洗人、希未人、耶布斯人都灭绝净尽，免得他们教导你们学习一切可憎恶的事，就是他们向自己神所行的，以致你们得罪耶和华－你们的　神。</w:t>
+      </w:r>
+      <w:r>
+        <w:rPr>
+          <w:rFonts w:ascii="楷体" w:eastAsia="楷体" w:hAnsi="楷体" w:cs="Times New Roman" w:hint="eastAsia"/>
+          <w:color w:val="000000"/>
+          <w:kern w:val="0"/>
+          <w:sz w:val="24"/>
+          <w14:ligatures w14:val="none"/>
+        </w:rPr>
+        <w:t>”</w:t>
+      </w:r>
+    </w:p>
+    <w:p>
+      <w:pPr>
+        <w:widowControl/>
+        <w:tabs>
+          <w:tab w:val="left" w:pos="420"/>
+        </w:tabs>
+        <w:spacing w:after="120" w:line="257" w:lineRule="auto"/>
+        <w:jc w:val="both"/>
+        <w:rPr>
+          <w:rFonts w:ascii="宋体" w:eastAsia="宋体" w:hAnsi="宋体" w:cs="Times New Roman" w:hint="eastAsia"/>
+          <w:color w:val="000000"/>
+          <w:kern w:val="0"/>
+          <w:sz w:val="24"/>
+          <w14:ligatures w14:val="none"/>
+        </w:rPr>
+      </w:pPr>
+      <w:r>
+        <w:rPr>
+          <w:rFonts w:ascii="宋体" w:eastAsia="宋体" w:hAnsi="宋体" w:cs="Times New Roman" w:hint="eastAsia"/>
+          <w:color w:val="000000"/>
+          <w:kern w:val="0"/>
+          <w:sz w:val="24"/>
+          <w14:ligatures w14:val="none"/>
+        </w:rPr>
+        <w:t>可是正如「</w:t>
+      </w:r>
+      <w:r>
+        <w:rPr>
+          <w:rFonts w:ascii="宋体" w:eastAsia="宋体" w:hAnsi="宋体" w:cs="Times New Roman" w:hint="eastAsia"/>
+          <w:color w:val="000000"/>
+          <w:kern w:val="0"/>
+          <w:sz w:val="24"/>
+          <w14:ligatures w14:val="none"/>
+        </w:rPr>
+        <w:t>以西结书</w:t>
+      </w:r>
+      <w:r>
+        <w:rPr>
+          <w:rFonts w:ascii="宋体" w:eastAsia="宋体" w:hAnsi="宋体" w:cs="Times New Roman" w:hint="eastAsia"/>
+          <w:color w:val="000000"/>
+          <w:kern w:val="0"/>
+          <w:sz w:val="24"/>
+          <w14:ligatures w14:val="none"/>
+        </w:rPr>
+        <w:t>16:2」神指出的，以色列人也做了“</w:t>
+      </w:r>
+      <w:r>
+        <w:rPr>
+          <w:rFonts w:ascii="宋体" w:eastAsia="宋体" w:hAnsi="宋体" w:cs="Times New Roman"/>
+          <w:color w:val="000000"/>
+          <w:kern w:val="0"/>
+          <w:sz w:val="24"/>
+          <w14:ligatures w14:val="none"/>
+        </w:rPr>
+        <w:t>可憎的事</w:t>
+      </w:r>
+      <w:r>
+        <w:rPr>
+          <w:rFonts w:ascii="宋体" w:eastAsia="宋体" w:hAnsi="宋体" w:cs="Times New Roman" w:hint="eastAsia"/>
+          <w:color w:val="000000"/>
+          <w:kern w:val="0"/>
+          <w:sz w:val="24"/>
+          <w14:ligatures w14:val="none"/>
+        </w:rPr>
+        <w:t>”，甚至比迦南人更糟糕。</w:t>
+      </w:r>
+    </w:p>
+    <w:p>
+      <w:pPr>
+        <w:widowControl/>
+        <w:tabs>
+          <w:tab w:val="left" w:pos="420"/>
+        </w:tabs>
+        <w:spacing w:after="120" w:line="257" w:lineRule="auto"/>
+        <w:jc w:val="both"/>
+        <w:rPr>
+          <w:rFonts w:ascii="宋体" w:eastAsia="宋体" w:hAnsi="宋体" w:cs="Times New Roman" w:hint="eastAsia"/>
+          <w:color w:val="000000"/>
+          <w:kern w:val="0"/>
+          <w:sz w:val="24"/>
+          <w14:ligatures w14:val="none"/>
+        </w:rPr>
+      </w:pPr>
+      <w:r>
+        <w:rPr>
+          <w:rFonts w:ascii="宋体" w:eastAsia="宋体" w:hAnsi="宋体" w:cs="Times New Roman" w:hint="eastAsia"/>
+          <w:color w:val="000000"/>
+          <w:kern w:val="0"/>
+          <w:sz w:val="24"/>
+          <w14:ligatures w14:val="none"/>
+        </w:rPr>
+        <w:t>v6神拣选、帮助、塑造以色列这个民族，应允他们：“</w:t>
+      </w:r>
+      <w:r>
+        <w:rPr>
+          <w:rFonts w:ascii="宋体" w:eastAsia="宋体" w:hAnsi="宋体" w:cs="Times New Roman"/>
+          <w:color w:val="000000"/>
+          <w:kern w:val="0"/>
+          <w:sz w:val="24"/>
+          <w14:ligatures w14:val="none"/>
+        </w:rPr>
+        <w:t>你虽在血中，仍可存活</w:t>
+      </w:r>
+      <w:r>
+        <w:rPr>
+          <w:rFonts w:ascii="宋体" w:eastAsia="宋体" w:hAnsi="宋体" w:cs="Times New Roman" w:hint="eastAsia"/>
+          <w:color w:val="000000"/>
+          <w:kern w:val="0"/>
+          <w:sz w:val="24"/>
+          <w14:ligatures w14:val="none"/>
+        </w:rPr>
+        <w:t>”。v7是对妻子的语气，显示神像丈夫照顾妻子一样，呵护以色列，</w:t>
+      </w:r>
+      <w:r>
+        <w:rPr>
+          <w:rFonts w:ascii="宋体" w:eastAsia="宋体" w:hAnsi="宋体" w:cs="Times New Roman" w:hint="eastAsia"/>
+          <w:color w:val="000000"/>
+          <w:kern w:val="0"/>
+          <w:sz w:val="24"/>
+          <w14:ligatures w14:val="none"/>
+        </w:rPr>
+        <w:t>带领</w:t>
+      </w:r>
+      <w:r>
+        <w:rPr>
+          <w:rFonts w:ascii="宋体" w:eastAsia="宋体" w:hAnsi="宋体" w:cs="Times New Roman" w:hint="eastAsia"/>
+          <w:color w:val="000000"/>
+          <w:kern w:val="0"/>
+          <w:sz w:val="24"/>
+          <w14:ligatures w14:val="none"/>
+        </w:rPr>
+        <w:t>他们</w:t>
+      </w:r>
+      <w:r>
+        <w:rPr>
+          <w:rFonts w:ascii="宋体" w:eastAsia="宋体" w:hAnsi="宋体" w:cs="Times New Roman" w:hint="eastAsia"/>
+          <w:color w:val="000000"/>
+          <w:kern w:val="0"/>
+          <w:sz w:val="24"/>
+          <w14:ligatures w14:val="none"/>
+        </w:rPr>
+        <w:t>成长。神借以西结，要以色列人看到他们当初的光景，知道神为他们做了什么，看清自己所行的一切邪恶的事，知道悔改。</w:t>
+      </w:r>
+    </w:p>
+    <w:p>
+      <w:pPr>
+        <w:widowControl/>
+        <w:tabs>
+          <w:tab w:val="left" w:pos="420"/>
+        </w:tabs>
+        <w:spacing w:after="120" w:line="257" w:lineRule="auto"/>
+        <w:jc w:val="both"/>
+        <w:rPr>
+          <w:rFonts w:ascii="宋体" w:eastAsia="宋体" w:hAnsi="宋体" w:cs="Times New Roman" w:hint="eastAsia"/>
+          <w:color w:val="000000"/>
+          <w:kern w:val="0"/>
+          <w:sz w:val="24"/>
+          <w14:ligatures w14:val="none"/>
+        </w:rPr>
+      </w:pPr>
+      <w:r>
+        <w:rPr>
+          <w:rFonts w:ascii="宋体" w:eastAsia="宋体" w:hAnsi="宋体" w:cs="Times New Roman" w:hint="eastAsia"/>
+          <w:color w:val="000000"/>
+          <w:kern w:val="0"/>
+          <w:sz w:val="24"/>
+          <w14:ligatures w14:val="none"/>
+        </w:rPr>
+        <w:t>v8 “</w:t>
+      </w:r>
+      <w:r>
+        <w:rPr>
+          <w:rFonts w:ascii="宋体" w:eastAsia="宋体" w:hAnsi="宋体" w:cs="Times New Roman"/>
+          <w:color w:val="000000"/>
+          <w:kern w:val="0"/>
+          <w:sz w:val="24"/>
+          <w14:ligatures w14:val="none"/>
+        </w:rPr>
+        <w:t>用衣襟搭在你身上</w:t>
+      </w:r>
+      <w:r>
+        <w:rPr>
+          <w:rFonts w:ascii="宋体" w:eastAsia="宋体" w:hAnsi="宋体" w:cs="Times New Roman" w:hint="eastAsia"/>
+          <w:color w:val="000000"/>
+          <w:kern w:val="0"/>
+          <w:sz w:val="24"/>
+          <w14:ligatures w14:val="none"/>
+        </w:rPr>
+        <w:t>”，表示你是我的妻子，正如波阿斯遮盖路德。“</w:t>
+      </w:r>
+      <w:r>
+        <w:rPr>
+          <w:rFonts w:ascii="宋体" w:eastAsia="宋体" w:hAnsi="宋体" w:cs="Times New Roman"/>
+          <w:color w:val="000000"/>
+          <w:kern w:val="0"/>
+          <w:sz w:val="24"/>
+          <w14:ligatures w14:val="none"/>
+        </w:rPr>
+        <w:t>又向你起誓，与你结盟，</w:t>
+      </w:r>
+      <w:r>
+        <w:rPr>
+          <w:rFonts w:ascii="宋体" w:eastAsia="宋体" w:hAnsi="宋体" w:cs="Times New Roman" w:hint="eastAsia"/>
+          <w:color w:val="000000"/>
+          <w:kern w:val="0"/>
+          <w:sz w:val="24"/>
+          <w14:ligatures w14:val="none"/>
+        </w:rPr>
+        <w:t>”以色列不仅是神眼中的妻子，更是祂所爱的，并与</w:t>
+      </w:r>
+      <w:r>
+        <w:rPr>
+          <w:rFonts w:ascii="宋体" w:eastAsia="宋体" w:hAnsi="宋体" w:cs="Times New Roman" w:hint="eastAsia"/>
+          <w:color w:val="000000"/>
+          <w:kern w:val="0"/>
+          <w:sz w:val="24"/>
+          <w14:ligatures w14:val="none"/>
+        </w:rPr>
+        <w:t>他们</w:t>
+      </w:r>
+      <w:r>
+        <w:rPr>
+          <w:rFonts w:ascii="宋体" w:eastAsia="宋体" w:hAnsi="宋体" w:cs="Times New Roman" w:hint="eastAsia"/>
+          <w:color w:val="000000"/>
+          <w:kern w:val="0"/>
+          <w:sz w:val="24"/>
+          <w14:ligatures w14:val="none"/>
+        </w:rPr>
+        <w:t>立下</w:t>
+      </w:r>
+      <w:r>
+        <w:rPr>
+          <w:rFonts w:ascii="宋体" w:eastAsia="宋体" w:hAnsi="宋体" w:cs="Times New Roman" w:hint="eastAsia"/>
+          <w:color w:val="000000"/>
+          <w:kern w:val="0"/>
+          <w:sz w:val="24"/>
+          <w14:ligatures w14:val="none"/>
+        </w:rPr>
+        <w:t>永远的</w:t>
+      </w:r>
+      <w:r>
+        <w:rPr>
+          <w:rFonts w:ascii="宋体" w:eastAsia="宋体" w:hAnsi="宋体" w:cs="Times New Roman" w:hint="eastAsia"/>
+          <w:color w:val="000000"/>
+          <w:kern w:val="0"/>
+          <w:sz w:val="24"/>
+          <w14:ligatures w14:val="none"/>
+        </w:rPr>
+        <w:t>“婚约</w:t>
+      </w:r>
+      <w:r>
+        <w:rPr>
+          <w:rFonts w:ascii="宋体" w:eastAsia="宋体" w:hAnsi="宋体" w:cs="Times New Roman" w:hint="eastAsia"/>
+          <w:color w:val="000000"/>
+          <w:kern w:val="0"/>
+          <w:sz w:val="24"/>
+          <w14:ligatures w14:val="none"/>
+        </w:rPr>
+        <w:t>”</w:t>
+      </w:r>
+      <w:r>
+        <w:rPr>
+          <w:rFonts w:ascii="宋体" w:eastAsia="宋体" w:hAnsi="宋体" w:cs="Times New Roman" w:hint="eastAsia"/>
+          <w:color w:val="000000"/>
+          <w:kern w:val="0"/>
+          <w:sz w:val="24"/>
+          <w14:ligatures w14:val="none"/>
+        </w:rPr>
+        <w:t>。</w:t>
+      </w:r>
+    </w:p>
+    <w:p>
+      <w:pPr>
+        <w:widowControl/>
+        <w:tabs>
+          <w:tab w:val="left" w:pos="420"/>
+        </w:tabs>
+        <w:spacing w:after="120" w:line="257" w:lineRule="auto"/>
+        <w:ind w:leftChars="100" w:left="220"/>
+        <w:jc w:val="both"/>
+        <w:rPr>
+          <w:rFonts w:ascii="楷体" w:eastAsia="楷体" w:hAnsi="楷体" w:cs="Times New Roman" w:hint="eastAsia"/>
+          <w:color w:val="000000"/>
+          <w:kern w:val="0"/>
+          <w:sz w:val="24"/>
+          <w14:ligatures w14:val="none"/>
+        </w:rPr>
+      </w:pPr>
+      <w:r>
+        <w:rPr>
+          <w:rFonts w:ascii="楷体" w:eastAsia="楷体" w:hAnsi="楷体" w:cs="Times New Roman" w:hint="eastAsia"/>
+          <w:color w:val="000000"/>
+          <w:kern w:val="0"/>
+          <w:sz w:val="24"/>
+          <w14:ligatures w14:val="none"/>
+        </w:rPr>
+        <w:lastRenderedPageBreak/>
+        <w:t>「耶利米书31:35」：“那使太阳白日发光，使星月有定例，黑夜发亮，又搅动大海，使海中波浪匉訇的，万军之耶和华是他的名。他如此说：这些定例若能在我面前废掉，以色列的后裔也就在我面前断绝，永远不再成国。这是耶和华说的耶和华如此说：若能量度上天，寻察下地的根基，我就因以色列后裔一切所行的弃绝他们。这是耶和华说的。”</w:t>
+      </w:r>
+    </w:p>
+    <w:p>
+      <w:pPr>
+        <w:widowControl/>
+        <w:tabs>
+          <w:tab w:val="left" w:pos="420"/>
+        </w:tabs>
+        <w:spacing w:after="120" w:line="257" w:lineRule="auto"/>
+        <w:jc w:val="both"/>
+        <w:rPr>
+          <w:rFonts w:ascii="宋体" w:eastAsia="宋体" w:hAnsi="宋体" w:cs="Times New Roman" w:hint="eastAsia"/>
+          <w:color w:val="000000"/>
+          <w:kern w:val="0"/>
+          <w:sz w:val="24"/>
+          <w14:ligatures w14:val="none"/>
+        </w:rPr>
+      </w:pPr>
+      <w:r>
+        <w:rPr>
+          <w:rFonts w:ascii="宋体" w:eastAsia="宋体" w:hAnsi="宋体" w:cs="Times New Roman" w:hint="eastAsia"/>
+          <w:color w:val="000000"/>
+          <w:kern w:val="0"/>
+          <w:sz w:val="24"/>
+          <w14:ligatures w14:val="none"/>
+        </w:rPr>
+        <w:t>v9-14 神通过以西结提醒以色列人，祂曾经如何洁净打扮以色列，带它成长，显示祂对以色列的爱。“</w:t>
+      </w:r>
+      <w:r>
+        <w:rPr>
+          <w:rFonts w:ascii="宋体" w:eastAsia="宋体" w:hAnsi="宋体" w:cs="Times New Roman"/>
+          <w:color w:val="000000"/>
+          <w:kern w:val="0"/>
+          <w:sz w:val="24"/>
+          <w14:ligatures w14:val="none"/>
+        </w:rPr>
+        <w:t>你美貌的名声传在列邦中，你十分美貌，是因我加在你身上的威荣。</w:t>
+      </w:r>
+      <w:r>
+        <w:rPr>
+          <w:rFonts w:ascii="宋体" w:eastAsia="宋体" w:hAnsi="宋体" w:cs="Times New Roman" w:hint="eastAsia"/>
+          <w:color w:val="000000"/>
+          <w:kern w:val="0"/>
+          <w:sz w:val="24"/>
+          <w14:ligatures w14:val="none"/>
+        </w:rPr>
+        <w:t>”以色列因神的爱，远超周围的国家。正如今日以色列远远领先于中东地区其他各国。神应许给亚伯拉罕、以撒、雅各的是从埃及尼罗河到幼发拉底河中间的那块地，包括约旦、叙利亚、黎巴嫩、伊拉克，现在的以色列国远小于神的应许。但到千禧年，那块地将会归属于以色列。</w:t>
+      </w:r>
+    </w:p>
+    <w:p>
+      <w:pPr>
+        <w:widowControl/>
+        <w:tabs>
+          <w:tab w:val="left" w:pos="420"/>
+        </w:tabs>
+        <w:spacing w:after="120" w:line="257" w:lineRule="auto"/>
+        <w:jc w:val="both"/>
+        <w:rPr>
+          <w:rFonts w:ascii="宋体" w:eastAsia="宋体" w:hAnsi="宋体" w:cs="Times New Roman" w:hint="eastAsia"/>
+          <w:b/>
+          <w:bCs/>
+          <w:color w:val="000000"/>
+          <w:kern w:val="0"/>
+          <w:sz w:val="24"/>
+          <w14:ligatures w14:val="none"/>
+        </w:rPr>
+      </w:pPr>
+      <w:r>
+        <w:rPr>
+          <w:rFonts w:ascii="宋体" w:eastAsia="宋体" w:hAnsi="宋体" w:cs="Times New Roman" w:hint="eastAsia"/>
+          <w:b/>
+          <w:bCs/>
+          <w:color w:val="000000"/>
+          <w:kern w:val="0"/>
+          <w:sz w:val="24"/>
+          <w14:ligatures w14:val="none"/>
+        </w:rPr>
+        <w:t>二、vv15-34  以色列人不断的叛逆，玷污了他们与耶和华神之间拥有的特殊关系</w:t>
+      </w:r>
+    </w:p>
+    <w:p>
+      <w:pPr>
+        <w:widowControl/>
+        <w:tabs>
+          <w:tab w:val="left" w:pos="420"/>
+        </w:tabs>
+        <w:spacing w:after="120" w:line="257" w:lineRule="auto"/>
+        <w:jc w:val="both"/>
+        <w:rPr>
+          <w:rFonts w:ascii="宋体" w:eastAsia="宋体" w:hAnsi="宋体" w:cs="Times New Roman" w:hint="eastAsia"/>
+          <w:color w:val="000000"/>
+          <w:kern w:val="0"/>
+          <w:sz w:val="24"/>
+          <w14:ligatures w14:val="none"/>
+        </w:rPr>
+      </w:pPr>
+      <w:r>
+        <w:rPr>
+          <w:rFonts w:ascii="宋体" w:eastAsia="宋体" w:hAnsi="宋体" w:cs="Times New Roman" w:hint="eastAsia"/>
+          <w:color w:val="000000"/>
+          <w:kern w:val="0"/>
+          <w:sz w:val="24"/>
+          <w14:ligatures w14:val="none"/>
+        </w:rPr>
+        <w:t>神爱世人，给人自由，可是以色列人却用神赐给他们的悖逆了神。“</w:t>
+      </w:r>
+      <w:r>
+        <w:rPr>
+          <w:rFonts w:ascii="宋体" w:eastAsia="宋体" w:hAnsi="宋体" w:cs="Times New Roman"/>
+          <w:color w:val="000000"/>
+          <w:kern w:val="0"/>
+          <w:sz w:val="24"/>
+          <w14:ligatures w14:val="none"/>
+        </w:rPr>
+        <w:t>仗着自己的美貌</w:t>
+      </w:r>
+      <w:r>
+        <w:rPr>
+          <w:rFonts w:ascii="宋体" w:eastAsia="宋体" w:hAnsi="宋体" w:cs="Times New Roman" w:hint="eastAsia"/>
+          <w:color w:val="000000"/>
+          <w:kern w:val="0"/>
+          <w:sz w:val="24"/>
+          <w14:ligatures w14:val="none"/>
+        </w:rPr>
+        <w:t>”，“</w:t>
+      </w:r>
+      <w:r>
+        <w:rPr>
+          <w:rFonts w:ascii="宋体" w:eastAsia="宋体" w:hAnsi="宋体" w:cs="Times New Roman"/>
+          <w:color w:val="000000"/>
+          <w:kern w:val="0"/>
+          <w:sz w:val="24"/>
+          <w14:ligatures w14:val="none"/>
+        </w:rPr>
+        <w:t>我所给你那华美的金银、宝器</w:t>
+      </w:r>
+      <w:r>
+        <w:rPr>
+          <w:rFonts w:ascii="宋体" w:eastAsia="宋体" w:hAnsi="宋体" w:cs="Times New Roman" w:hint="eastAsia"/>
+          <w:color w:val="000000"/>
+          <w:kern w:val="0"/>
+          <w:sz w:val="24"/>
+          <w14:ligatures w14:val="none"/>
+        </w:rPr>
+        <w:t>”制造偶像，“</w:t>
+      </w:r>
+      <w:r>
+        <w:rPr>
+          <w:rFonts w:ascii="宋体" w:eastAsia="宋体" w:hAnsi="宋体" w:cs="Times New Roman"/>
+          <w:color w:val="000000"/>
+          <w:kern w:val="0"/>
+          <w:sz w:val="24"/>
+          <w14:ligatures w14:val="none"/>
+        </w:rPr>
+        <w:t>我赐给你的食物</w:t>
+      </w:r>
+      <w:r>
+        <w:rPr>
+          <w:rFonts w:ascii="宋体" w:eastAsia="宋体" w:hAnsi="宋体" w:cs="Times New Roman" w:hint="eastAsia"/>
+          <w:color w:val="000000"/>
+          <w:kern w:val="0"/>
+          <w:sz w:val="24"/>
+          <w14:ligatures w14:val="none"/>
+        </w:rPr>
+        <w:t>”先给偶像，用“</w:t>
+      </w:r>
+      <w:r>
+        <w:rPr>
+          <w:rFonts w:ascii="宋体" w:eastAsia="宋体" w:hAnsi="宋体" w:cs="Times New Roman"/>
+          <w:color w:val="000000"/>
+          <w:kern w:val="0"/>
+          <w:sz w:val="24"/>
+          <w14:ligatures w14:val="none"/>
+        </w:rPr>
+        <w:t>给我所生的儿女</w:t>
+      </w:r>
+      <w:r>
+        <w:rPr>
+          <w:rFonts w:ascii="宋体" w:eastAsia="宋体" w:hAnsi="宋体" w:cs="Times New Roman" w:hint="eastAsia"/>
+          <w:color w:val="000000"/>
+          <w:kern w:val="0"/>
+          <w:sz w:val="24"/>
+          <w14:ligatures w14:val="none"/>
+        </w:rPr>
+        <w:t>”献给巴力神。以色列人全然不顾念神对他们的看顾。</w:t>
+      </w:r>
+    </w:p>
+    <w:p>
+      <w:pPr>
+        <w:widowControl/>
+        <w:tabs>
+          <w:tab w:val="left" w:pos="420"/>
+        </w:tabs>
+        <w:spacing w:after="120" w:line="257" w:lineRule="auto"/>
+        <w:ind w:leftChars="100" w:left="220"/>
+        <w:jc w:val="both"/>
+        <w:rPr>
+          <w:rFonts w:ascii="楷体" w:eastAsia="楷体" w:hAnsi="楷体" w:cs="Times New Roman" w:hint="eastAsia"/>
+          <w:color w:val="000000"/>
+          <w:kern w:val="0"/>
+          <w:sz w:val="24"/>
+          <w14:ligatures w14:val="none"/>
+        </w:rPr>
+      </w:pPr>
+      <w:r>
+        <w:rPr>
+          <w:rFonts w:ascii="楷体" w:eastAsia="楷体" w:hAnsi="楷体" w:cs="Times New Roman" w:hint="eastAsia"/>
+          <w:color w:val="000000"/>
+          <w:kern w:val="0"/>
+          <w:sz w:val="24"/>
+          <w14:ligatures w14:val="none"/>
+        </w:rPr>
+        <w:t>「耶利米书19:5」：“</w:t>
+      </w:r>
+      <w:r>
+        <w:rPr>
+          <w:rFonts w:ascii="楷体" w:eastAsia="楷体" w:hAnsi="楷体" w:cs="Times New Roman"/>
+          <w:color w:val="000000"/>
+          <w:kern w:val="0"/>
+          <w:sz w:val="24"/>
+          <w14:ligatures w14:val="none"/>
+        </w:rPr>
+        <w:t>又建筑巴力的邱坛，好在火中焚烧自己的儿子，作为燔祭献给巴力。这不是我所吩咐的，不是我所提说的，也不是我心所起的意。</w:t>
+      </w:r>
+      <w:r>
+        <w:rPr>
+          <w:rFonts w:ascii="楷体" w:eastAsia="楷体" w:hAnsi="楷体" w:cs="Times New Roman" w:hint="eastAsia"/>
+          <w:color w:val="000000"/>
+          <w:kern w:val="0"/>
+          <w:sz w:val="24"/>
+          <w14:ligatures w14:val="none"/>
+        </w:rPr>
+        <w:t>”</w:t>
+      </w:r>
+    </w:p>
+    <w:p>
+      <w:pPr>
+        <w:widowControl/>
+        <w:tabs>
+          <w:tab w:val="left" w:pos="420"/>
+        </w:tabs>
+        <w:spacing w:after="120" w:line="257" w:lineRule="auto"/>
+        <w:jc w:val="both"/>
+        <w:rPr>
+          <w:rFonts w:ascii="宋体" w:eastAsia="宋体" w:hAnsi="宋体" w:cs="Times New Roman" w:hint="eastAsia"/>
+          <w:color w:val="000000"/>
+          <w:kern w:val="0"/>
+          <w:sz w:val="24"/>
+          <w14:ligatures w14:val="none"/>
+        </w:rPr>
+      </w:pPr>
+      <w:r>
+        <w:rPr>
+          <w:rFonts w:ascii="宋体" w:eastAsia="宋体" w:hAnsi="宋体" w:cs="Times New Roman" w:hint="eastAsia"/>
+          <w:color w:val="000000"/>
+          <w:kern w:val="0"/>
+          <w:sz w:val="24"/>
+          <w14:ligatures w14:val="none"/>
+        </w:rPr>
+        <w:t>神要以色列人回想当初的窘况，追念祂对他们的拯救。</w:t>
+      </w:r>
+    </w:p>
+    <w:p>
+      <w:pPr>
+        <w:widowControl/>
+        <w:tabs>
+          <w:tab w:val="left" w:pos="420"/>
+        </w:tabs>
+        <w:spacing w:after="120" w:line="257" w:lineRule="auto"/>
+        <w:jc w:val="both"/>
+        <w:rPr>
+          <w:rFonts w:ascii="宋体" w:eastAsia="宋体" w:hAnsi="宋体" w:cs="Times New Roman" w:hint="eastAsia"/>
+          <w:color w:val="000000"/>
+          <w:kern w:val="0"/>
+          <w:sz w:val="24"/>
+          <w14:ligatures w14:val="none"/>
+        </w:rPr>
+      </w:pPr>
+      <w:r>
+        <w:rPr>
+          <w:rFonts w:ascii="宋体" w:eastAsia="宋体" w:hAnsi="宋体" w:cs="Times New Roman" w:hint="eastAsia"/>
+          <w:color w:val="000000"/>
+          <w:kern w:val="0"/>
+          <w:sz w:val="24"/>
+          <w14:ligatures w14:val="none"/>
+        </w:rPr>
+        <w:t>“……</w:t>
+      </w:r>
+      <w:r>
+        <w:rPr>
+          <w:rFonts w:ascii="宋体" w:eastAsia="宋体" w:hAnsi="宋体" w:cs="Times New Roman"/>
+          <w:color w:val="000000"/>
+          <w:kern w:val="0"/>
+          <w:sz w:val="24"/>
+          <w14:ligatures w14:val="none"/>
+        </w:rPr>
+        <w:t>在各街上做了高台</w:t>
+      </w:r>
+      <w:r>
+        <w:rPr>
+          <w:rFonts w:ascii="宋体" w:eastAsia="宋体" w:hAnsi="宋体" w:cs="Times New Roman" w:hint="eastAsia"/>
+          <w:color w:val="000000"/>
+          <w:kern w:val="0"/>
+          <w:sz w:val="24"/>
+          <w14:ligatures w14:val="none"/>
+        </w:rPr>
+        <w:t>……</w:t>
+      </w:r>
+      <w:r>
+        <w:rPr>
+          <w:rFonts w:ascii="宋体" w:eastAsia="宋体" w:hAnsi="宋体" w:cs="Times New Roman"/>
+          <w:color w:val="000000"/>
+          <w:kern w:val="0"/>
+          <w:sz w:val="24"/>
+          <w14:ligatures w14:val="none"/>
+        </w:rPr>
+        <w:t>又与一切过路的多行淫乱</w:t>
+      </w:r>
+      <w:r>
+        <w:rPr>
+          <w:rFonts w:ascii="宋体" w:eastAsia="宋体" w:hAnsi="宋体" w:cs="Times New Roman" w:hint="eastAsia"/>
+          <w:color w:val="000000"/>
+          <w:kern w:val="0"/>
+          <w:sz w:val="24"/>
+          <w14:ligatures w14:val="none"/>
+        </w:rPr>
+        <w:t>”，以色列本应只把自己开放给神，可是他们却讨好周遭的列国，周围的所有人。巴比伦人攻打他们，他们不依靠神，却去请求埃及人、亚述人的帮助。</w:t>
+      </w:r>
+    </w:p>
+    <w:p>
+      <w:pPr>
+        <w:widowControl/>
+        <w:tabs>
+          <w:tab w:val="left" w:pos="420"/>
+        </w:tabs>
+        <w:spacing w:after="120" w:line="257" w:lineRule="auto"/>
+        <w:jc w:val="both"/>
+        <w:rPr>
+          <w:rFonts w:ascii="宋体" w:eastAsia="宋体" w:hAnsi="宋体" w:cs="Times New Roman" w:hint="eastAsia"/>
+          <w:color w:val="000000"/>
+          <w:kern w:val="0"/>
+          <w:sz w:val="24"/>
+          <w14:ligatures w14:val="none"/>
+        </w:rPr>
+      </w:pPr>
+      <w:r>
+        <w:rPr>
+          <w:rFonts w:ascii="宋体" w:eastAsia="宋体" w:hAnsi="宋体" w:cs="Times New Roman" w:hint="eastAsia"/>
+          <w:color w:val="000000"/>
+          <w:kern w:val="0"/>
+          <w:sz w:val="24"/>
+          <w14:ligatures w14:val="none"/>
+        </w:rPr>
+        <w:t>而且以色列还把神赐给他们的送给别人。“</w:t>
+      </w:r>
+      <w:r>
+        <w:rPr>
+          <w:rFonts w:ascii="宋体" w:eastAsia="宋体" w:hAnsi="宋体" w:cs="Times New Roman"/>
+          <w:color w:val="000000"/>
+          <w:kern w:val="0"/>
+          <w:sz w:val="24"/>
+          <w14:ligatures w14:val="none"/>
+        </w:rPr>
+        <w:t>凡妓女是得人赠送，你反倒赠送你所爱的人，贿赂他们从四围来与你行淫。</w:t>
+      </w:r>
+      <w:r>
+        <w:rPr>
+          <w:rFonts w:ascii="宋体" w:eastAsia="宋体" w:hAnsi="宋体" w:cs="Times New Roman" w:hint="eastAsia"/>
+          <w:color w:val="000000"/>
+          <w:kern w:val="0"/>
+          <w:sz w:val="24"/>
+          <w14:ligatures w14:val="none"/>
+        </w:rPr>
+        <w:t>”1948年以色列复国时，仅有小小的一块土地，但在之后的几次战争中拿回了很多本属于他们的土地。可后来以色列又把西奈半岛、加沙等地还给别人，</w:t>
+      </w:r>
+      <w:r>
+        <w:rPr>
+          <w:rFonts w:ascii="宋体" w:eastAsia="宋体" w:hAnsi="宋体" w:cs="Times New Roman" w:hint="eastAsia"/>
+          <w:color w:val="000000"/>
+          <w:kern w:val="0"/>
+          <w:sz w:val="24"/>
+          <w14:ligatures w14:val="none"/>
+        </w:rPr>
+        <w:t>去讨好人，</w:t>
+      </w:r>
+      <w:r>
+        <w:rPr>
+          <w:rFonts w:ascii="宋体" w:eastAsia="宋体" w:hAnsi="宋体" w:cs="Times New Roman" w:hint="eastAsia"/>
+          <w:color w:val="000000"/>
+          <w:kern w:val="0"/>
+          <w:sz w:val="24"/>
+          <w14:ligatures w14:val="none"/>
+        </w:rPr>
+        <w:t>这是神所不喜悦的。他们以为会有平安，但并没有，因为这是神给他们的土地。</w:t>
+      </w:r>
+    </w:p>
+    <w:p>
+      <w:pPr>
+        <w:widowControl/>
+        <w:tabs>
+          <w:tab w:val="left" w:pos="420"/>
+        </w:tabs>
+        <w:spacing w:after="120" w:line="257" w:lineRule="auto"/>
+        <w:jc w:val="both"/>
+        <w:rPr>
+          <w:rFonts w:ascii="宋体" w:eastAsia="宋体" w:hAnsi="宋体" w:cs="Times New Roman" w:hint="eastAsia"/>
+          <w:b/>
+          <w:bCs/>
+          <w:color w:val="000000"/>
+          <w:kern w:val="0"/>
+          <w:sz w:val="24"/>
+          <w14:ligatures w14:val="none"/>
+        </w:rPr>
+      </w:pPr>
+      <w:r>
+        <w:rPr>
+          <w:rFonts w:ascii="宋体" w:eastAsia="宋体" w:hAnsi="宋体" w:cs="Times New Roman" w:hint="eastAsia"/>
+          <w:b/>
+          <w:bCs/>
+          <w:color w:val="000000"/>
+          <w:kern w:val="0"/>
+          <w:sz w:val="24"/>
+          <w14:ligatures w14:val="none"/>
+        </w:rPr>
+        <w:t>三、vv35-43  耶和华神必须对祂的选民以色列采取的行动和结果</w:t>
+      </w:r>
+    </w:p>
+    <w:p>
+      <w:pPr>
+        <w:widowControl/>
+        <w:tabs>
+          <w:tab w:val="left" w:pos="420"/>
+        </w:tabs>
+        <w:spacing w:after="120" w:line="257" w:lineRule="auto"/>
+        <w:jc w:val="both"/>
+        <w:rPr>
+          <w:rFonts w:ascii="宋体" w:eastAsia="宋体" w:hAnsi="宋体" w:cs="Times New Roman"/>
+          <w:color w:val="000000"/>
+          <w:kern w:val="0"/>
+          <w:sz w:val="24"/>
+          <w14:ligatures w14:val="none"/>
+        </w:rPr>
+      </w:pPr>
+      <w:r>
+        <w:rPr>
+          <w:rFonts w:ascii="宋体" w:eastAsia="宋体" w:hAnsi="宋体" w:cs="Times New Roman" w:hint="eastAsia"/>
+          <w:color w:val="000000"/>
+          <w:kern w:val="0"/>
+          <w:sz w:val="24"/>
+          <w14:ligatures w14:val="none"/>
+        </w:rPr>
+        <w:t>v35-38：以色列悖逆神，神要向他们讨罪。</w:t>
+      </w:r>
+    </w:p>
+    <w:p>
+      <w:pPr>
+        <w:widowControl/>
+        <w:tabs>
+          <w:tab w:val="left" w:pos="420"/>
+        </w:tabs>
+        <w:spacing w:after="120" w:line="257" w:lineRule="auto"/>
+        <w:jc w:val="both"/>
+        <w:rPr>
+          <w:rFonts w:ascii="宋体" w:eastAsia="宋体" w:hAnsi="宋体" w:cs="Times New Roman"/>
+          <w:color w:val="000000"/>
+          <w:kern w:val="0"/>
+          <w:sz w:val="24"/>
+          <w14:ligatures w14:val="none"/>
+        </w:rPr>
+      </w:pPr>
+      <w:r>
+        <w:rPr>
+          <w:rFonts w:ascii="宋体" w:eastAsia="宋体" w:hAnsi="宋体" w:cs="Times New Roman" w:hint="eastAsia"/>
+          <w:color w:val="000000"/>
+          <w:kern w:val="0"/>
+          <w:sz w:val="24"/>
+          <w14:ligatures w14:val="none"/>
+        </w:rPr>
+        <w:t>v39-41a：神用以色列的敌人攻击他们，如最近的哈马斯，历史上的巴比伦、罗马帝国。</w:t>
+      </w:r>
+    </w:p>
+    <w:p>
+      <w:pPr>
+        <w:widowControl/>
+        <w:tabs>
+          <w:tab w:val="left" w:pos="420"/>
+        </w:tabs>
+        <w:spacing w:after="120" w:line="257" w:lineRule="auto"/>
+        <w:jc w:val="both"/>
+        <w:rPr>
+          <w:rFonts w:ascii="宋体" w:eastAsia="宋体" w:hAnsi="宋体" w:cs="Times New Roman"/>
+          <w:color w:val="000000"/>
+          <w:kern w:val="0"/>
+          <w:sz w:val="24"/>
+          <w14:ligatures w14:val="none"/>
+        </w:rPr>
+      </w:pPr>
+      <w:r>
+        <w:rPr>
+          <w:rFonts w:ascii="宋体" w:eastAsia="宋体" w:hAnsi="宋体" w:cs="Times New Roman" w:hint="eastAsia"/>
+          <w:color w:val="000000"/>
+          <w:kern w:val="0"/>
+          <w:sz w:val="24"/>
+          <w14:ligatures w14:val="none"/>
+        </w:rPr>
+        <w:t>v41b-v4</w:t>
+      </w:r>
+      <w:r>
+        <w:rPr>
+          <w:rFonts w:ascii="宋体" w:eastAsia="宋体" w:hAnsi="宋体" w:cs="Times New Roman" w:hint="eastAsia"/>
+          <w:color w:val="000000"/>
+          <w:kern w:val="0"/>
+          <w:sz w:val="24"/>
+          <w14:ligatures w14:val="none"/>
+        </w:rPr>
+        <w:t>3</w:t>
+      </w:r>
+      <w:r>
+        <w:rPr>
+          <w:rFonts w:ascii="宋体" w:eastAsia="宋体" w:hAnsi="宋体" w:cs="Times New Roman" w:hint="eastAsia"/>
+          <w:color w:val="000000"/>
+          <w:kern w:val="0"/>
+          <w:sz w:val="24"/>
+          <w14:ligatures w14:val="none"/>
+        </w:rPr>
+        <w:t>：还要发生在将来</w:t>
+      </w:r>
+    </w:p>
+    <w:p>
+      <w:pPr>
+        <w:widowControl/>
+        <w:tabs>
+          <w:tab w:val="left" w:pos="420"/>
+        </w:tabs>
+        <w:spacing w:after="120" w:line="257" w:lineRule="auto"/>
+        <w:jc w:val="both"/>
+        <w:rPr>
+          <w:rFonts w:ascii="宋体" w:eastAsia="宋体" w:hAnsi="宋体" w:cs="Times New Roman" w:hint="eastAsia"/>
+          <w:color w:val="000000"/>
+          <w:kern w:val="0"/>
+          <w:sz w:val="24"/>
+          <w14:ligatures w14:val="none"/>
+        </w:rPr>
+      </w:pPr>
+      <w:r>
+        <w:rPr>
+          <w:rFonts w:ascii="宋体" w:eastAsia="宋体" w:hAnsi="宋体" w:cs="Times New Roman" w:hint="eastAsia"/>
+          <w:color w:val="000000"/>
+          <w:kern w:val="0"/>
+          <w:sz w:val="24"/>
+          <w14:ligatures w14:val="none"/>
+        </w:rPr>
+        <w:t>如今的教会也是耶和华的新妇，我们也要追念当初，不要悖逆神。</w:t>
+      </w:r>
+    </w:p>
+    <w:p>
+      <w:pPr>
+        <w:widowControl/>
+        <w:tabs>
+          <w:tab w:val="left" w:pos="420"/>
+        </w:tabs>
+        <w:spacing w:after="120" w:line="257" w:lineRule="auto"/>
+        <w:jc w:val="both"/>
+        <w:rPr>
+          <w:rFonts w:ascii="宋体" w:eastAsia="宋体" w:hAnsi="宋体" w:cs="Times New Roman" w:hint="eastAsia"/>
+          <w:b/>
+          <w:bCs/>
+          <w:color w:val="000000"/>
+          <w:kern w:val="0"/>
+          <w:sz w:val="24"/>
+          <w14:ligatures w14:val="none"/>
+        </w:rPr>
+      </w:pPr>
+      <w:r>
+        <w:rPr>
+          <w:rFonts w:ascii="宋体" w:eastAsia="宋体" w:hAnsi="宋体" w:cs="Times New Roman" w:hint="eastAsia"/>
+          <w:b/>
+          <w:bCs/>
+          <w:color w:val="000000"/>
+          <w:kern w:val="0"/>
+          <w:sz w:val="24"/>
+          <w14:ligatures w14:val="none"/>
+        </w:rPr>
+        <w:t>四、vv44-59  以色列的亲属从未犯下像以色列那可憎的罪行</w:t>
+      </w:r>
+    </w:p>
+    <w:p>
+      <w:pPr>
+        <w:widowControl/>
+        <w:tabs>
+          <w:tab w:val="left" w:pos="420"/>
+        </w:tabs>
+        <w:spacing w:after="120" w:line="257" w:lineRule="auto"/>
+        <w:jc w:val="both"/>
+        <w:rPr>
+          <w:rFonts w:ascii="宋体" w:eastAsia="宋体" w:hAnsi="宋体" w:cs="Times New Roman"/>
+          <w:color w:val="000000"/>
+          <w:kern w:val="0"/>
+          <w:sz w:val="24"/>
+          <w14:ligatures w14:val="none"/>
+        </w:rPr>
+      </w:pPr>
+      <w:r>
+        <w:rPr>
+          <w:rFonts w:ascii="宋体" w:eastAsia="宋体" w:hAnsi="宋体" w:cs="Times New Roman" w:hint="eastAsia"/>
+          <w:color w:val="000000"/>
+          <w:kern w:val="0"/>
+          <w:sz w:val="24"/>
+          <w14:ligatures w14:val="none"/>
+        </w:rPr>
+        <w:lastRenderedPageBreak/>
+        <w:t>v44-52：神把迦南送给以色列，但以色列所做的比原先住在迦南的人更糟糕。神所说的以色列的姐妹，撒玛利亚在以色列的北面，所多玛在以色列的南面。所以神让他们灭国，把他们赶到世界各国。</w:t>
+      </w:r>
+    </w:p>
+    <w:p>
+      <w:pPr>
+        <w:widowControl/>
+        <w:tabs>
+          <w:tab w:val="left" w:pos="420"/>
+        </w:tabs>
+        <w:spacing w:after="120" w:line="257" w:lineRule="auto"/>
+        <w:jc w:val="both"/>
+        <w:rPr>
+          <w:rFonts w:ascii="宋体" w:eastAsia="宋体" w:hAnsi="宋体" w:cs="Times New Roman"/>
+          <w:color w:val="000000"/>
+          <w:kern w:val="0"/>
+          <w:sz w:val="24"/>
+          <w14:ligatures w14:val="none"/>
+        </w:rPr>
+      </w:pPr>
+      <w:r>
+        <w:rPr>
+          <w:rFonts w:ascii="宋体" w:eastAsia="宋体" w:hAnsi="宋体" w:cs="Times New Roman" w:hint="eastAsia"/>
+          <w:color w:val="000000"/>
+          <w:kern w:val="0"/>
+          <w:sz w:val="24"/>
+          <w14:ligatures w14:val="none"/>
+        </w:rPr>
+        <w:t>v53-55：神借着以西结的口告诉他们，神要复兴以色列，还要复兴撒玛利亚、所多玛，因为神有怜悯。</w:t>
+      </w:r>
+    </w:p>
+    <w:p>
+      <w:pPr>
+        <w:widowControl/>
+        <w:tabs>
+          <w:tab w:val="left" w:pos="420"/>
+        </w:tabs>
+        <w:spacing w:after="120" w:line="257" w:lineRule="auto"/>
+        <w:jc w:val="both"/>
+        <w:rPr>
+          <w:rFonts w:ascii="宋体" w:eastAsia="宋体" w:hAnsi="宋体" w:cs="Times New Roman"/>
+          <w:color w:val="000000"/>
+          <w:kern w:val="0"/>
+          <w:sz w:val="24"/>
+          <w14:ligatures w14:val="none"/>
+        </w:rPr>
+      </w:pPr>
+      <w:r>
+        <w:rPr>
+          <w:rFonts w:ascii="宋体" w:eastAsia="宋体" w:hAnsi="宋体" w:cs="Times New Roman" w:hint="eastAsia"/>
+          <w:color w:val="000000"/>
+          <w:kern w:val="0"/>
+          <w:sz w:val="24"/>
+          <w14:ligatures w14:val="none"/>
+        </w:rPr>
+        <w:t>v56-5</w:t>
+      </w:r>
+      <w:r>
+        <w:rPr>
+          <w:rFonts w:ascii="宋体" w:eastAsia="宋体" w:hAnsi="宋体" w:cs="Times New Roman" w:hint="eastAsia"/>
+          <w:color w:val="000000"/>
+          <w:kern w:val="0"/>
+          <w:sz w:val="24"/>
+          <w14:ligatures w14:val="none"/>
+        </w:rPr>
+        <w:t>8：神惩罚以色列人，所以以色列的敌人都嘲笑他们。</w:t>
+      </w:r>
+    </w:p>
+    <w:p>
+      <w:pPr>
+        <w:widowControl/>
+        <w:tabs>
+          <w:tab w:val="left" w:pos="420"/>
+        </w:tabs>
+        <w:spacing w:after="120" w:line="257" w:lineRule="auto"/>
+        <w:jc w:val="both"/>
+        <w:rPr>
+          <w:rFonts w:ascii="宋体" w:eastAsia="宋体" w:hAnsi="宋体" w:cs="Times New Roman"/>
+          <w:color w:val="000000"/>
+          <w:kern w:val="0"/>
+          <w:sz w:val="24"/>
+          <w14:ligatures w14:val="none"/>
+        </w:rPr>
+      </w:pPr>
+      <w:r>
+        <w:rPr>
+          <w:rFonts w:ascii="宋体" w:eastAsia="宋体" w:hAnsi="宋体" w:cs="Times New Roman" w:hint="eastAsia"/>
+          <w:color w:val="000000"/>
+          <w:kern w:val="0"/>
+          <w:sz w:val="24"/>
+          <w14:ligatures w14:val="none"/>
+        </w:rPr>
+        <w:t>v59：神是因为以色列人的罪孽惩罚他们。犯罪有后果，以色列人要承担后果。</w:t>
+      </w:r>
+    </w:p>
+    <w:p>
+      <w:pPr>
+        <w:widowControl/>
+        <w:tabs>
+          <w:tab w:val="left" w:pos="420"/>
+        </w:tabs>
+        <w:spacing w:after="120" w:line="257" w:lineRule="auto"/>
+        <w:jc w:val="both"/>
+        <w:rPr>
+          <w:rFonts w:ascii="宋体" w:eastAsia="宋体" w:hAnsi="宋体" w:cs="Times New Roman"/>
+          <w:b/>
+          <w:bCs/>
+          <w:color w:val="000000"/>
+          <w:kern w:val="0"/>
+          <w:sz w:val="24"/>
+          <w14:ligatures w14:val="none"/>
+        </w:rPr>
+      </w:pPr>
+      <w:r>
+        <w:rPr>
+          <w:rFonts w:ascii="宋体" w:eastAsia="宋体" w:hAnsi="宋体" w:cs="Times New Roman" w:hint="eastAsia"/>
+          <w:b/>
+          <w:bCs/>
+          <w:color w:val="000000"/>
+          <w:kern w:val="0"/>
+          <w:sz w:val="24"/>
+          <w14:ligatures w14:val="none"/>
+        </w:rPr>
+        <w:t>五、vv60-63  耶和华神纪念祂与以色列所立的约，必带来饶恕和洁净</w:t>
+      </w:r>
+    </w:p>
+    <w:p>
+      <w:pPr>
+        <w:widowControl/>
+        <w:tabs>
+          <w:tab w:val="left" w:pos="420"/>
+        </w:tabs>
+        <w:spacing w:after="120" w:line="257" w:lineRule="auto"/>
+        <w:jc w:val="both"/>
+        <w:rPr>
+          <w:rFonts w:ascii="宋体" w:eastAsia="宋体" w:hAnsi="宋体" w:cs="Times New Roman"/>
+          <w:color w:val="000000"/>
+          <w:kern w:val="0"/>
+          <w:sz w:val="24"/>
+          <w14:ligatures w14:val="none"/>
+        </w:rPr>
+      </w:pPr>
+      <w:r>
+        <w:rPr>
+          <w:rFonts w:ascii="宋体" w:eastAsia="宋体" w:hAnsi="宋体" w:cs="Times New Roman" w:hint="eastAsia"/>
+          <w:color w:val="000000"/>
+          <w:kern w:val="0"/>
+          <w:sz w:val="24"/>
+          <w14:ligatures w14:val="none"/>
+        </w:rPr>
+        <w:t>v60：神救以色列人，是因为祂纪念与过去以色列人立过的约，并要在将来</w:t>
+      </w:r>
+      <w:r>
+        <w:rPr>
+          <w:rFonts w:ascii="宋体" w:eastAsia="宋体" w:hAnsi="宋体" w:cs="Times New Roman" w:hint="eastAsia"/>
+          <w:color w:val="000000"/>
+          <w:kern w:val="0"/>
+          <w:sz w:val="24"/>
+          <w14:ligatures w14:val="none"/>
+        </w:rPr>
+        <w:t>，也就是最后七年</w:t>
+      </w:r>
+      <w:r>
+        <w:rPr>
+          <w:rFonts w:ascii="宋体" w:eastAsia="宋体" w:hAnsi="宋体" w:cs="Times New Roman" w:hint="eastAsia"/>
+          <w:color w:val="000000"/>
+          <w:kern w:val="0"/>
+          <w:sz w:val="24"/>
+          <w14:ligatures w14:val="none"/>
+        </w:rPr>
+        <w:t>，立定新约。</w:t>
+      </w:r>
+    </w:p>
+    <w:p>
+      <w:pPr>
+        <w:widowControl/>
+        <w:tabs>
+          <w:tab w:val="left" w:pos="420"/>
+        </w:tabs>
+        <w:spacing w:after="120" w:line="257" w:lineRule="auto"/>
+        <w:ind w:leftChars="100" w:left="220"/>
+        <w:jc w:val="both"/>
+        <w:rPr>
+          <w:rFonts w:ascii="楷体" w:eastAsia="楷体" w:hAnsi="楷体" w:cs="Times New Roman"/>
+          <w:color w:val="000000"/>
+          <w:kern w:val="0"/>
+          <w:sz w:val="24"/>
+          <w14:ligatures w14:val="none"/>
+        </w:rPr>
+      </w:pPr>
+      <w:r>
+        <w:rPr>
+          <w:rFonts w:ascii="楷体" w:eastAsia="楷体" w:hAnsi="楷体" w:cs="Times New Roman" w:hint="eastAsia"/>
+          <w:color w:val="000000"/>
+          <w:kern w:val="0"/>
+          <w:sz w:val="24"/>
+          <w14:ligatures w14:val="none"/>
+        </w:rPr>
+        <w:t>「耶利米书31:31</w:t>
+      </w:r>
+      <w:r>
+        <w:rPr>
+          <w:rFonts w:ascii="楷体" w:eastAsia="楷体" w:hAnsi="楷体" w:cs="Times New Roman" w:hint="eastAsia"/>
+          <w:color w:val="000000"/>
+          <w:kern w:val="0"/>
+          <w:sz w:val="24"/>
+          <w14:ligatures w14:val="none"/>
+        </w:rPr>
+        <w:t>-34</w:t>
+      </w:r>
+      <w:r>
+        <w:rPr>
+          <w:rFonts w:ascii="楷体" w:eastAsia="楷体" w:hAnsi="楷体" w:cs="Times New Roman" w:hint="eastAsia"/>
+          <w:color w:val="000000"/>
+          <w:kern w:val="0"/>
+          <w:sz w:val="24"/>
+          <w14:ligatures w14:val="none"/>
+        </w:rPr>
+        <w:t>」：“</w:t>
+      </w:r>
+      <w:r>
+        <w:rPr>
+          <w:rFonts w:ascii="楷体" w:eastAsia="楷体" w:hAnsi="楷体" w:cs="Times New Roman"/>
+          <w:color w:val="000000"/>
+          <w:kern w:val="0"/>
+          <w:sz w:val="24"/>
+          <w14:ligatures w14:val="none"/>
+        </w:rPr>
+        <w:t>耶和华说：「日子将到，我要与以色列家和犹大家另立新约，不像我拉着他们祖宗的手，领他们出埃及地的时候，与他们所立的约。我虽作他们的丈夫，他们却背了我的约。这是耶和华说的。」耶和华说：「那些日子以后，我与以色列家所立的约乃是这样：我要将我的律法放在他们里面，写在他们心上。我要作他们的　神，他们要作我的子民。他们各人不再教导自己的邻舍和自己的弟兄说：『你该认识耶和华』，因为他们从最小的到至大的都必认识我。我要赦免他们的罪孽，不再记念他们的罪恶。这是耶和华说的。」</w:t>
+      </w:r>
+      <w:r>
+        <w:rPr>
+          <w:rFonts w:ascii="楷体" w:eastAsia="楷体" w:hAnsi="楷体" w:cs="Times New Roman" w:hint="eastAsia"/>
+          <w:color w:val="000000"/>
+          <w:kern w:val="0"/>
+          <w:sz w:val="24"/>
+          <w14:ligatures w14:val="none"/>
+        </w:rPr>
+        <w:t>”</w:t>
+      </w:r>
+    </w:p>
+    <w:p>
+      <w:pPr>
+        <w:widowControl/>
+        <w:tabs>
+          <w:tab w:val="left" w:pos="420"/>
+        </w:tabs>
+        <w:spacing w:after="120" w:line="257" w:lineRule="auto"/>
+        <w:jc w:val="both"/>
+        <w:rPr>
+          <w:rFonts w:ascii="宋体" w:eastAsia="宋体" w:hAnsi="宋体" w:cs="Times New Roman"/>
+          <w:color w:val="000000"/>
+          <w:kern w:val="0"/>
+          <w:sz w:val="24"/>
+          <w14:ligatures w14:val="none"/>
+        </w:rPr>
+      </w:pPr>
+      <w:r>
+        <w:rPr>
+          <w:rFonts w:ascii="宋体" w:eastAsia="宋体" w:hAnsi="宋体" w:cs="Times New Roman" w:hint="eastAsia"/>
+          <w:color w:val="000000"/>
+          <w:kern w:val="0"/>
+          <w:sz w:val="24"/>
+          <w14:ligatures w14:val="none"/>
+        </w:rPr>
+        <w:t>v6</w:t>
+      </w:r>
+      <w:r>
+        <w:rPr>
+          <w:rFonts w:ascii="宋体" w:eastAsia="宋体" w:hAnsi="宋体" w:cs="Times New Roman" w:hint="eastAsia"/>
+          <w:color w:val="000000"/>
+          <w:kern w:val="0"/>
+          <w:sz w:val="24"/>
+          <w14:ligatures w14:val="none"/>
+        </w:rPr>
+        <w:t>1-63</w:t>
+      </w:r>
+      <w:r>
+        <w:rPr>
+          <w:rFonts w:ascii="宋体" w:eastAsia="宋体" w:hAnsi="宋体" w:cs="Times New Roman" w:hint="eastAsia"/>
+          <w:color w:val="000000"/>
+          <w:kern w:val="0"/>
+          <w:sz w:val="24"/>
+          <w14:ligatures w14:val="none"/>
+        </w:rPr>
+        <w:t>：</w:t>
+      </w:r>
+      <w:r>
+        <w:rPr>
+          <w:rFonts w:ascii="宋体" w:eastAsia="宋体" w:hAnsi="宋体" w:cs="Times New Roman" w:hint="eastAsia"/>
+          <w:color w:val="000000"/>
+          <w:kern w:val="0"/>
+          <w:sz w:val="24"/>
+          <w14:ligatures w14:val="none"/>
+        </w:rPr>
+        <w:t>到将来犹太人的第七十个七年，以色列人的赎罪日到了，他们要醒悟忏悔赎罪。</w:t>
+      </w:r>
+    </w:p>
+    <w:p>
+      <w:pPr>
+        <w:widowControl/>
+        <w:tabs>
+          <w:tab w:val="left" w:pos="420"/>
+        </w:tabs>
+        <w:spacing w:after="120" w:line="257" w:lineRule="auto"/>
+        <w:jc w:val="both"/>
+        <w:rPr>
+          <w:rFonts w:ascii="宋体" w:eastAsia="宋体" w:hAnsi="宋体" w:cs="Times New Roman" w:hint="eastAsia"/>
+          <w:color w:val="000000"/>
+          <w:kern w:val="0"/>
+          <w:sz w:val="24"/>
+          <w14:ligatures w14:val="none"/>
+        </w:rPr>
+      </w:pPr>
+      <w:r>
+        <w:rPr>
+          <w:rFonts w:ascii="宋体" w:eastAsia="宋体" w:hAnsi="宋体" w:cs="Times New Roman" w:hint="eastAsia"/>
+          <w:color w:val="000000"/>
+          <w:kern w:val="0"/>
+          <w:sz w:val="24"/>
+          <w14:ligatures w14:val="none"/>
+        </w:rPr>
+        <w:t>这一章神向世人宣告以色列的罪孽。</w:t>
+      </w:r>
+      <w:r>
+        <w:rPr>
+          <w:rFonts w:ascii="宋体" w:eastAsia="宋体" w:hAnsi="宋体" w:cs="Times New Roman" w:hint="eastAsia"/>
+          <w:color w:val="000000"/>
+          <w:kern w:val="0"/>
+          <w:sz w:val="24"/>
+          <w14:ligatures w14:val="none"/>
+        </w:rPr>
+        <w:t>但神已经与他们立约，所以1948年，以色列一天就复国了。当下的伊朗战争很快就会平息，以色列会有安然居住的日子，但根据「以西结38-39」另一场更大的战争就要来临。</w:t>
+      </w:r>
     </w:p>
     <w:sectPr>
       <w:pgSz w:w="11906" w:h="16838"/>

</xml_diff>